<commit_message>
commit and reset for env secret
</commit_message>
<xml_diff>
--- a/GenAI by Sheryians Notes.docx
+++ b/GenAI by Sheryians Notes.docx
@@ -40,7 +40,21 @@
         <w:rPr>
           <w:lang w:val="en-US"/>
         </w:rPr>
-        <w:t>Use uv:</w:t>
+        <w:t xml:space="preserve">Use </w:t>
+      </w:r>
+      <w:proofErr w:type="spellStart"/>
+      <w:r>
+        <w:rPr>
+          <w:lang w:val="en-US"/>
+        </w:rPr>
+        <w:t>uv</w:t>
+      </w:r>
+      <w:proofErr w:type="spellEnd"/>
+      <w:r>
+        <w:rPr>
+          <w:lang w:val="en-US"/>
+        </w:rPr>
+        <w:t>:</w:t>
       </w:r>
       <w:r>
         <w:rPr>
@@ -61,7 +75,31 @@
         </w:numPr>
       </w:pPr>
       <w:r>
-        <w:t>A single tool to replace pip, pip-tools, pipx, poetry, pyenv, twine, virtualenv, and more.</w:t>
+        <w:t>A single tool to replace pip, pip-tools, </w:t>
+      </w:r>
+      <w:proofErr w:type="spellStart"/>
+      <w:r>
+        <w:t>pipx</w:t>
+      </w:r>
+      <w:proofErr w:type="spellEnd"/>
+      <w:r>
+        <w:t>, poetry, </w:t>
+      </w:r>
+      <w:proofErr w:type="spellStart"/>
+      <w:r>
+        <w:t>pyenv</w:t>
+      </w:r>
+      <w:proofErr w:type="spellEnd"/>
+      <w:r>
+        <w:t>, twine, </w:t>
+      </w:r>
+      <w:proofErr w:type="spellStart"/>
+      <w:r>
+        <w:t>virtualenv</w:t>
+      </w:r>
+      <w:proofErr w:type="spellEnd"/>
+      <w:r>
+        <w:t>, and more.</w:t>
       </w:r>
     </w:p>
     <w:p>
@@ -109,155 +147,18 @@
           <w:rPr>
             <w:rStyle w:val="Hyperlink"/>
           </w:rPr>
-          <w:t>universal lockfile</w:t>
+          <w:t xml:space="preserve">universal </w:t>
         </w:r>
-      </w:hyperlink>
-      <w:r>
-        <w:t>.</w:t>
-      </w:r>
-    </w:p>
-    <w:p>
-      <w:pPr>
-        <w:rPr>
-          <w:lang w:val="en-US"/>
-        </w:rPr>
-      </w:pPr>
-      <w:r>
-        <w:rPr>
-          <w:lang w:val="en-US"/>
-        </w:rPr>
-        <w:t xml:space="preserve">Define API key in separate file </w:t>
-      </w:r>
-      <w:r>
-        <w:rPr>
-          <w:lang w:val="en-US"/>
-        </w:rPr>
-        <w:t>usually in .env file</w:t>
-      </w:r>
-    </w:p>
-    <w:p>
-      <w:pPr>
-        <w:rPr>
-          <w:lang w:val="en-US"/>
-        </w:rPr>
-      </w:pPr>
-      <w:r>
-        <w:rPr>
-          <w:lang w:val="en-US"/>
-        </w:rPr>
-        <w:t>G</w:t>
-      </w:r>
-      <w:r>
-        <w:rPr>
-          <w:lang w:val="en-US"/>
-        </w:rPr>
-        <w:t>ro</w:t>
-      </w:r>
-      <w:r>
-        <w:rPr>
-          <w:lang w:val="en-US"/>
-        </w:rPr>
-        <w:t>q can be used for free API Keys for many LLMs</w:t>
-      </w:r>
-      <w:r>
-        <w:rPr>
-          <w:lang w:val="en-US"/>
-        </w:rPr>
-        <w:t>.</w:t>
-      </w:r>
-    </w:p>
-    <w:p>
-      <w:pPr>
-        <w:rPr>
-          <w:lang w:val="en-US"/>
-        </w:rPr>
-      </w:pPr>
-    </w:p>
-    <w:p>
-      <w:pPr>
-        <w:rPr>
-          <w:lang w:val="en-US"/>
-        </w:rPr>
-      </w:pPr>
-      <w:r>
-        <w:rPr>
-          <w:lang w:val="en-US"/>
-        </w:rPr>
-        <w:t>Using Python , more token are burnt in using Gemini as compared to Java script</w:t>
-      </w:r>
-      <w:r>
-        <w:rPr>
-          <w:lang w:val="en-US"/>
-        </w:rPr>
-        <w:t>.</w:t>
-      </w:r>
-    </w:p>
-    <w:p>
-      <w:pPr>
-        <w:rPr>
-          <w:lang w:val="en-US"/>
-        </w:rPr>
-      </w:pPr>
-    </w:p>
-    <w:p>
-      <w:r>
-        <w:rPr>
-          <w:lang w:val="en-US"/>
-        </w:rPr>
-        <w:t xml:space="preserve">Use </w:t>
-      </w:r>
-      <w:r>
-        <w:rPr>
-          <w:b/>
-          <w:bCs/>
-        </w:rPr>
-        <w:t>python-dotenv</w:t>
-      </w:r>
-      <w:r>
-        <w:t xml:space="preserve"> library</w:t>
-      </w:r>
-      <w:r>
-        <w:t xml:space="preserve"> </w:t>
-      </w:r>
-      <w:r>
-        <w:t>for managing "secrets" like API keys, database passwords, and configuration settings.</w:t>
-      </w:r>
-      <w:r>
-        <w:t>it reads key-value pairs from a .env file and adds them to your system's environment variables.</w:t>
-      </w:r>
-    </w:p>
-    <w:p>
-      <w:pPr>
-        <w:rPr>
-          <w:b/>
-          <w:bCs/>
-        </w:rPr>
-      </w:pPr>
-      <w:r>
-        <w:rPr>
-          <w:b/>
-          <w:bCs/>
-        </w:rPr>
-        <w:br/>
-        <w:t>Initialize a model</w:t>
-      </w:r>
-    </w:p>
-    <w:p>
-      <w:r>
-        <w:t>The easiest way to get started with a standalone model in LangChain is to use </w:t>
-      </w:r>
-      <w:hyperlink r:id="rId8" w:tgtFrame="_blank" w:history="1">
+        <w:proofErr w:type="spellStart"/>
         <w:r>
           <w:rPr>
             <w:rStyle w:val="Hyperlink"/>
           </w:rPr>
-          <w:t>init_chat_model</w:t>
+          <w:t>lockfile</w:t>
         </w:r>
+        <w:proofErr w:type="spellEnd"/>
       </w:hyperlink>
       <w:r>
-        <w:t> to initialize one from a chat model provider of your choice</w:t>
-      </w:r>
-      <w:r>
         <w:t>.</w:t>
       </w:r>
     </w:p>
@@ -267,25 +168,232 @@
           <w:lang w:val="en-US"/>
         </w:rPr>
       </w:pPr>
-      <w:r>
-        <w:t xml:space="preserve">Using </w:t>
+      <w:proofErr w:type="gramStart"/>
+      <w:r>
+        <w:rPr>
+          <w:lang w:val="en-US"/>
+        </w:rPr>
+        <w:t>Define</w:t>
+      </w:r>
+      <w:proofErr w:type="gramEnd"/>
+      <w:r>
+        <w:rPr>
+          <w:lang w:val="en-US"/>
+        </w:rPr>
+        <w:t xml:space="preserve"> API key in separate file </w:t>
+      </w:r>
+      <w:r>
+        <w:rPr>
+          <w:lang w:val="en-US"/>
+        </w:rPr>
+        <w:t>usually in .env file</w:t>
+      </w:r>
+    </w:p>
+    <w:p>
+      <w:pPr>
+        <w:rPr>
+          <w:lang w:val="en-US"/>
+        </w:rPr>
+      </w:pPr>
+      <w:proofErr w:type="spellStart"/>
+      <w:r>
+        <w:rPr>
+          <w:lang w:val="en-US"/>
+        </w:rPr>
+        <w:t>G</w:t>
+      </w:r>
+      <w:r>
+        <w:rPr>
+          <w:lang w:val="en-US"/>
+        </w:rPr>
+        <w:t>ro</w:t>
+      </w:r>
+      <w:r>
+        <w:rPr>
+          <w:lang w:val="en-US"/>
+        </w:rPr>
+        <w:t>q</w:t>
+      </w:r>
+      <w:proofErr w:type="spellEnd"/>
+      <w:r>
+        <w:rPr>
+          <w:lang w:val="en-US"/>
+        </w:rPr>
+        <w:t xml:space="preserve"> can be used for free API Keys for many LLMs</w:t>
+      </w:r>
+      <w:r>
+        <w:rPr>
+          <w:lang w:val="en-US"/>
+        </w:rPr>
+        <w:t>.</w:t>
+      </w:r>
+    </w:p>
+    <w:p>
+      <w:pPr>
+        <w:rPr>
+          <w:lang w:val="en-US"/>
+        </w:rPr>
+      </w:pPr>
+    </w:p>
+    <w:p>
+      <w:pPr>
+        <w:rPr>
+          <w:lang w:val="en-US"/>
+        </w:rPr>
+      </w:pPr>
+      <w:r>
+        <w:rPr>
+          <w:lang w:val="en-US"/>
+        </w:rPr>
+        <w:t xml:space="preserve">Using Python , more </w:t>
+      </w:r>
+      <w:proofErr w:type="gramStart"/>
+      <w:r>
+        <w:rPr>
+          <w:lang w:val="en-US"/>
+        </w:rPr>
+        <w:t>token</w:t>
+      </w:r>
+      <w:proofErr w:type="gramEnd"/>
+      <w:r>
+        <w:rPr>
+          <w:lang w:val="en-US"/>
+        </w:rPr>
+        <w:t xml:space="preserve"> are burnt in using Gemini as compared to Java script</w:t>
+      </w:r>
+      <w:r>
+        <w:rPr>
+          <w:lang w:val="en-US"/>
+        </w:rPr>
+        <w:t>.</w:t>
+      </w:r>
+    </w:p>
+    <w:p>
+      <w:pPr>
+        <w:rPr>
+          <w:lang w:val="en-US"/>
+        </w:rPr>
+      </w:pPr>
+    </w:p>
+    <w:p>
+      <w:r>
+        <w:rPr>
+          <w:lang w:val="en-US"/>
+        </w:rPr>
+        <w:t xml:space="preserve">Use </w:t>
       </w:r>
       <w:r>
         <w:rPr>
           <w:b/>
           <w:bCs/>
         </w:rPr>
+        <w:t>python-</w:t>
+      </w:r>
+      <w:proofErr w:type="spellStart"/>
+      <w:r>
+        <w:rPr>
+          <w:b/>
+          <w:bCs/>
+        </w:rPr>
+        <w:t>dotenv</w:t>
+      </w:r>
+      <w:proofErr w:type="spellEnd"/>
+      <w:r>
+        <w:t xml:space="preserve"> library</w:t>
+      </w:r>
+      <w:r>
+        <w:t xml:space="preserve"> </w:t>
+      </w:r>
+      <w:r>
+        <w:t>for managing "secrets" like API keys, database passwords, and configuration settings.</w:t>
+      </w:r>
+      <w:r>
+        <w:t>it reads key-value pairs from a .env file and adds them to your system's environment variables.</w:t>
+      </w:r>
+    </w:p>
+    <w:p>
+      <w:pPr>
+        <w:rPr>
+          <w:b/>
+          <w:bCs/>
+        </w:rPr>
+      </w:pPr>
+      <w:r>
+        <w:rPr>
+          <w:b/>
+          <w:bCs/>
+        </w:rPr>
+        <w:br/>
+        <w:t>Initialize a model</w:t>
+      </w:r>
+    </w:p>
+    <w:p>
+      <w:r>
+        <w:t xml:space="preserve">The easiest way to get started with a standalone model in </w:t>
+      </w:r>
+      <w:proofErr w:type="spellStart"/>
+      <w:r>
+        <w:t>LangChain</w:t>
+      </w:r>
+      <w:proofErr w:type="spellEnd"/>
+      <w:r>
+        <w:t xml:space="preserve"> is to use </w:t>
+      </w:r>
+      <w:proofErr w:type="spellStart"/>
+      <w:r>
+        <w:fldChar w:fldCharType="begin"/>
+      </w:r>
+      <w:r>
+        <w:instrText>HYPERLINK "https://reference.langchain.com/python/langchain/chat_models/base/init_chat_model" \t "_blank"</w:instrText>
+      </w:r>
+      <w:r>
+        <w:fldChar w:fldCharType="separate"/>
+      </w:r>
+      <w:r>
+        <w:rPr>
+          <w:rStyle w:val="Hyperlink"/>
+        </w:rPr>
         <w:t>init_chat_model</w:t>
       </w:r>
-    </w:p>
-    <w:p>
-      <w:pPr>
-        <w:rPr>
-          <w:lang w:val="en-US"/>
-        </w:rPr>
-      </w:pPr>
-      <w:r>
-        <w:rPr>
+      <w:proofErr w:type="spellEnd"/>
+      <w:r>
+        <w:fldChar w:fldCharType="end"/>
+      </w:r>
+      <w:r>
+        <w:t> to initialize one from a chat model provider of your choice</w:t>
+      </w:r>
+      <w:r>
+        <w:t>.</w:t>
+      </w:r>
+    </w:p>
+    <w:p>
+      <w:pPr>
+        <w:rPr>
+          <w:lang w:val="en-US"/>
+        </w:rPr>
+      </w:pPr>
+      <w:r>
+        <w:t xml:space="preserve">Using </w:t>
+      </w:r>
+      <w:proofErr w:type="spellStart"/>
+      <w:r>
+        <w:rPr>
+          <w:b/>
+          <w:bCs/>
+        </w:rPr>
+        <w:t>init_chat_model</w:t>
+      </w:r>
+      <w:proofErr w:type="spellEnd"/>
+    </w:p>
+    <w:p>
+      <w:pPr>
+        <w:rPr>
+          <w:lang w:val="en-US"/>
+        </w:rPr>
+      </w:pPr>
+      <w:r>
+        <w:rPr>
+          <w:noProof/>
           <w:lang w:val="en-US"/>
         </w:rPr>
         <w:drawing>
@@ -304,7 +412,7 @@
                     <pic:cNvPicPr/>
                   </pic:nvPicPr>
                   <pic:blipFill>
-                    <a:blip r:embed="rId9"/>
+                    <a:blip r:embed="rId8"/>
                     <a:stretch>
                       <a:fillRect/>
                     </a:stretch>
@@ -351,6 +459,7 @@
       </w:pPr>
       <w:r>
         <w:rPr>
+          <w:noProof/>
           <w:lang w:val="en-US"/>
         </w:rPr>
         <w:drawing>
@@ -369,7 +478,7 @@
                     <pic:cNvPicPr/>
                   </pic:nvPicPr>
                   <pic:blipFill>
-                    <a:blip r:embed="rId10"/>
+                    <a:blip r:embed="rId9"/>
                     <a:stretch>
                       <a:fillRect/>
                     </a:stretch>
@@ -409,10 +518,19 @@
         <w:t>Model Classes</w:t>
       </w:r>
       <w:r>
-        <w:t xml:space="preserve"> require provider-specific imports (e.g., ChatOpenAI) and hardcode your application to a single LLM vendor.</w:t>
-      </w:r>
-    </w:p>
-    <w:p>
+        <w:t xml:space="preserve"> require provider-specific imports (e.g., </w:t>
+      </w:r>
+      <w:proofErr w:type="spellStart"/>
+      <w:r>
+        <w:t>ChatOpenAI</w:t>
+      </w:r>
+      <w:proofErr w:type="spellEnd"/>
+      <w:r>
+        <w:t>) and hardcode your application to a single LLM vendor.</w:t>
+      </w:r>
+    </w:p>
+    <w:p>
+      <w:proofErr w:type="spellStart"/>
       <w:r>
         <w:rPr>
           <w:b/>
@@ -420,6 +538,7 @@
         </w:rPr>
         <w:t>init_chat_model</w:t>
       </w:r>
+      <w:proofErr w:type="spellEnd"/>
       <w:r>
         <w:t xml:space="preserve"> is a unified factory function that lets you dynamically swap providers (OpenAI, Anthropic, etc.) using simple string arguments without changing your imports or code structure.</w:t>
       </w:r>
@@ -433,24 +552,142 @@
         <w:t>Recommendation:</w:t>
       </w:r>
       <w:r>
-        <w:t xml:space="preserve"> Use init_chat_model by default to keep your code flexible, future-proof, and decoupled from specific vendors.</w:t>
-      </w:r>
-    </w:p>
-    <w:p/>
-    <w:p>
-      <w:r>
-        <w:t>QUESTION: How API keys are working without get os en</w:t>
+        <w:t xml:space="preserve"> Use </w:t>
+      </w:r>
+      <w:proofErr w:type="spellStart"/>
+      <w:r>
+        <w:t>init_chat_model</w:t>
+      </w:r>
+      <w:proofErr w:type="spellEnd"/>
+      <w:r>
+        <w:t xml:space="preserve"> by default to keep your code flexible, future-proof, and decoupled from specific vendors.</w:t>
+      </w:r>
+    </w:p>
+    <w:p>
+      <w:r>
+        <w:rPr>
+          <w:b/>
+          <w:bCs/>
+        </w:rPr>
+        <w:t>QUESTION</w:t>
+      </w:r>
+      <w:r>
+        <w:t xml:space="preserve">: How API keys are working without get </w:t>
+      </w:r>
+      <w:proofErr w:type="spellStart"/>
+      <w:r>
+        <w:t>os</w:t>
+      </w:r>
+      <w:proofErr w:type="spellEnd"/>
+      <w:r>
+        <w:t xml:space="preserve"> en</w:t>
       </w:r>
       <w:r>
         <w:t>v method</w:t>
       </w:r>
     </w:p>
     <w:p>
-      <w:pPr>
-        <w:rPr>
-          <w:lang w:val="en-US"/>
-        </w:rPr>
-      </w:pPr>
+      <w:r>
+        <w:t xml:space="preserve">The primary difference between </w:t>
+      </w:r>
+      <w:r>
+        <w:rPr>
+          <w:b/>
+          <w:bCs/>
+        </w:rPr>
+        <w:t>embed query</w:t>
+      </w:r>
+      <w:r>
+        <w:t xml:space="preserve"> and </w:t>
+      </w:r>
+      <w:r>
+        <w:rPr>
+          <w:b/>
+          <w:bCs/>
+        </w:rPr>
+        <w:t>embed document</w:t>
+      </w:r>
+      <w:r>
+        <w:t xml:space="preserve"> lies in their role within a search system:</w:t>
+      </w:r>
+    </w:p>
+    <w:p>
+      <w:r>
+        <w:rPr>
+          <w:b/>
+          <w:bCs/>
+        </w:rPr>
+        <w:t xml:space="preserve">embed document </w:t>
+      </w:r>
+      <w:r>
+        <w:t>converts static source data into vectors for storage,</w:t>
+      </w:r>
+    </w:p>
+    <w:p>
+      <w:r>
+        <w:rPr>
+          <w:b/>
+          <w:bCs/>
+        </w:rPr>
+        <w:t xml:space="preserve">while embed query </w:t>
+      </w:r>
+      <w:r>
+        <w:t>converts a real-time user request into a vector to find those matching documents</w:t>
+      </w:r>
+    </w:p>
+    <w:p>
+      <w:pPr>
+        <w:rPr>
+          <w:lang w:val="en-US"/>
+        </w:rPr>
+      </w:pPr>
+    </w:p>
+    <w:p>
+      <w:pPr>
+        <w:rPr>
+          <w:lang w:val="en-US"/>
+        </w:rPr>
+      </w:pPr>
+      <w:r>
+        <w:rPr>
+          <w:lang w:val="en-US"/>
+        </w:rPr>
+        <w:drawing>
+          <wp:inline distT="0" distB="0" distL="0" distR="0" wp14:anchorId="2D948DA2" wp14:editId="503000AA">
+            <wp:extent cx="5731464" cy="1578634"/>
+            <wp:effectExtent l="0" t="0" r="3175" b="2540"/>
+            <wp:docPr id="740513672" name="Picture 1" descr="A screen shot of a computer&#10;&#10;AI-generated content may be incorrect."/>
+            <wp:cNvGraphicFramePr>
+              <a:graphicFrameLocks xmlns:a="http://schemas.openxmlformats.org/drawingml/2006/main" noChangeAspect="1"/>
+            </wp:cNvGraphicFramePr>
+            <a:graphic xmlns:a="http://schemas.openxmlformats.org/drawingml/2006/main">
+              <a:graphicData uri="http://schemas.openxmlformats.org/drawingml/2006/picture">
+                <pic:pic xmlns:pic="http://schemas.openxmlformats.org/drawingml/2006/picture">
+                  <pic:nvPicPr>
+                    <pic:cNvPr id="740513672" name="Picture 1" descr="A screen shot of a computer&#10;&#10;AI-generated content may be incorrect."/>
+                    <pic:cNvPicPr/>
+                  </pic:nvPicPr>
+                  <pic:blipFill>
+                    <a:blip r:embed="rId10"/>
+                    <a:stretch>
+                      <a:fillRect/>
+                    </a:stretch>
+                  </pic:blipFill>
+                  <pic:spPr>
+                    <a:xfrm>
+                      <a:off x="0" y="0"/>
+                      <a:ext cx="5734656" cy="1579513"/>
+                    </a:xfrm>
+                    <a:prstGeom prst="rect">
+                      <a:avLst/>
+                    </a:prstGeom>
+                  </pic:spPr>
+                </pic:pic>
+              </a:graphicData>
+            </a:graphic>
+          </wp:inline>
+        </w:drawing>
+      </w:r>
     </w:p>
     <w:sectPr>
       <w:pgSz w:w="11906" w:h="16838"/>

</xml_diff>

<commit_message>
prompt template movie extraction
</commit_message>
<xml_diff>
--- a/GenAI by Sheryians Notes.docx
+++ b/GenAI by Sheryians Notes.docx
@@ -713,6 +713,9 @@
     </w:p>
     <w:p>
       <w:r>
+        <w:rPr>
+          <w:noProof/>
+        </w:rPr>
         <w:drawing>
           <wp:inline distT="0" distB="0" distL="0" distR="0" wp14:anchorId="61DEC78A" wp14:editId="36E57123">
             <wp:extent cx="5731510" cy="3050540"/>
@@ -753,11 +756,14 @@
     <w:p/>
     <w:p>
       <w:r>
+        <w:rPr>
+          <w:noProof/>
+        </w:rPr>
         <w:lastRenderedPageBreak/>
         <w:drawing>
-          <wp:inline distT="0" distB="0" distL="0" distR="0" wp14:anchorId="381D1C39" wp14:editId="4FD091BF">
-            <wp:extent cx="5344271" cy="2210108"/>
-            <wp:effectExtent l="0" t="0" r="8890" b="0"/>
+          <wp:inline distT="0" distB="0" distL="0" distR="0" wp14:anchorId="381D1C39" wp14:editId="684E0B81">
+            <wp:extent cx="5342494" cy="1733909"/>
+            <wp:effectExtent l="0" t="0" r="0" b="0"/>
             <wp:docPr id="1094063006" name="Picture 1"/>
             <wp:cNvGraphicFramePr>
               <a:graphicFrameLocks xmlns:a="http://schemas.openxmlformats.org/drawingml/2006/main" noChangeAspect="1"/>
@@ -778,7 +784,7 @@
                   <pic:spPr>
                     <a:xfrm>
                       <a:off x="0" y="0"/>
-                      <a:ext cx="5344271" cy="2210108"/>
+                      <a:ext cx="5350559" cy="1736527"/>
                     </a:xfrm>
                     <a:prstGeom prst="rect">
                       <a:avLst/>
@@ -794,6 +800,9 @@
     <w:p/>
     <w:p>
       <w:r>
+        <w:rPr>
+          <w:noProof/>
+        </w:rPr>
         <w:drawing>
           <wp:inline distT="0" distB="0" distL="0" distR="0" wp14:anchorId="6A13796F" wp14:editId="7C3A244B">
             <wp:extent cx="5731510" cy="2171700"/>
@@ -832,6 +841,408 @@
       </w:r>
     </w:p>
     <w:p/>
+    <w:p>
+      <w:r>
+        <w:drawing>
+          <wp:inline distT="0" distB="0" distL="0" distR="0" wp14:anchorId="6BF994C8" wp14:editId="384459CE">
+            <wp:extent cx="5511800" cy="905298"/>
+            <wp:effectExtent l="0" t="0" r="0" b="9525"/>
+            <wp:docPr id="1450442996" name="Picture 1"/>
+            <wp:cNvGraphicFramePr>
+              <a:graphicFrameLocks xmlns:a="http://schemas.openxmlformats.org/drawingml/2006/main" noChangeAspect="1"/>
+            </wp:cNvGraphicFramePr>
+            <a:graphic xmlns:a="http://schemas.openxmlformats.org/drawingml/2006/main">
+              <a:graphicData uri="http://schemas.openxmlformats.org/drawingml/2006/picture">
+                <pic:pic xmlns:pic="http://schemas.openxmlformats.org/drawingml/2006/picture">
+                  <pic:nvPicPr>
+                    <pic:cNvPr id="1450442996" name=""/>
+                    <pic:cNvPicPr/>
+                  </pic:nvPicPr>
+                  <pic:blipFill>
+                    <a:blip r:embed="rId15"/>
+                    <a:stretch>
+                      <a:fillRect/>
+                    </a:stretch>
+                  </pic:blipFill>
+                  <pic:spPr>
+                    <a:xfrm>
+                      <a:off x="0" y="0"/>
+                      <a:ext cx="5555498" cy="912475"/>
+                    </a:xfrm>
+                    <a:prstGeom prst="rect">
+                      <a:avLst/>
+                    </a:prstGeom>
+                  </pic:spPr>
+                </pic:pic>
+              </a:graphicData>
+            </a:graphic>
+          </wp:inline>
+        </w:drawing>
+      </w:r>
+    </w:p>
+    <w:p/>
+    <w:p>
+      <w:r>
+        <w:t>Prompt Template Use case:</w:t>
+      </w:r>
+    </w:p>
+    <w:p>
+      <w:r>
+        <w:drawing>
+          <wp:inline distT="0" distB="0" distL="0" distR="0" wp14:anchorId="1A221E35" wp14:editId="630E8976">
+            <wp:extent cx="4847042" cy="1915064"/>
+            <wp:effectExtent l="0" t="0" r="0" b="9525"/>
+            <wp:docPr id="2106698834" name="Picture 1"/>
+            <wp:cNvGraphicFramePr>
+              <a:graphicFrameLocks xmlns:a="http://schemas.openxmlformats.org/drawingml/2006/main" noChangeAspect="1"/>
+            </wp:cNvGraphicFramePr>
+            <a:graphic xmlns:a="http://schemas.openxmlformats.org/drawingml/2006/main">
+              <a:graphicData uri="http://schemas.openxmlformats.org/drawingml/2006/picture">
+                <pic:pic xmlns:pic="http://schemas.openxmlformats.org/drawingml/2006/picture">
+                  <pic:nvPicPr>
+                    <pic:cNvPr id="2106698834" name=""/>
+                    <pic:cNvPicPr/>
+                  </pic:nvPicPr>
+                  <pic:blipFill>
+                    <a:blip r:embed="rId16"/>
+                    <a:stretch>
+                      <a:fillRect/>
+                    </a:stretch>
+                  </pic:blipFill>
+                  <pic:spPr>
+                    <a:xfrm>
+                      <a:off x="0" y="0"/>
+                      <a:ext cx="4873650" cy="1925577"/>
+                    </a:xfrm>
+                    <a:prstGeom prst="rect">
+                      <a:avLst/>
+                    </a:prstGeom>
+                  </pic:spPr>
+                </pic:pic>
+              </a:graphicData>
+            </a:graphic>
+          </wp:inline>
+        </w:drawing>
+      </w:r>
+    </w:p>
+    <w:p>
+      <w:r>
+        <w:lastRenderedPageBreak/>
+        <w:drawing>
+          <wp:inline distT="0" distB="0" distL="0" distR="0" wp14:anchorId="04309CDC" wp14:editId="01B348DA">
+            <wp:extent cx="5253355" cy="1345721"/>
+            <wp:effectExtent l="0" t="0" r="4445" b="6985"/>
+            <wp:docPr id="1519450265" name="Picture 1"/>
+            <wp:cNvGraphicFramePr>
+              <a:graphicFrameLocks xmlns:a="http://schemas.openxmlformats.org/drawingml/2006/main" noChangeAspect="1"/>
+            </wp:cNvGraphicFramePr>
+            <a:graphic xmlns:a="http://schemas.openxmlformats.org/drawingml/2006/main">
+              <a:graphicData uri="http://schemas.openxmlformats.org/drawingml/2006/picture">
+                <pic:pic xmlns:pic="http://schemas.openxmlformats.org/drawingml/2006/picture">
+                  <pic:nvPicPr>
+                    <pic:cNvPr id="1519450265" name=""/>
+                    <pic:cNvPicPr/>
+                  </pic:nvPicPr>
+                  <pic:blipFill>
+                    <a:blip r:embed="rId17"/>
+                    <a:stretch>
+                      <a:fillRect/>
+                    </a:stretch>
+                  </pic:blipFill>
+                  <pic:spPr>
+                    <a:xfrm>
+                      <a:off x="0" y="0"/>
+                      <a:ext cx="5277811" cy="1351986"/>
+                    </a:xfrm>
+                    <a:prstGeom prst="rect">
+                      <a:avLst/>
+                    </a:prstGeom>
+                  </pic:spPr>
+                </pic:pic>
+              </a:graphicData>
+            </a:graphic>
+          </wp:inline>
+        </w:drawing>
+      </w:r>
+    </w:p>
+    <w:p/>
+    <w:p>
+      <w:r>
+        <w:drawing>
+          <wp:inline distT="0" distB="0" distL="0" distR="0" wp14:anchorId="43A2412C" wp14:editId="1B383A38">
+            <wp:extent cx="5731510" cy="1703070"/>
+            <wp:effectExtent l="0" t="0" r="2540" b="0"/>
+            <wp:docPr id="226375215" name="Picture 1" descr="A white background with black text&#10;&#10;AI-generated content may be incorrect."/>
+            <wp:cNvGraphicFramePr>
+              <a:graphicFrameLocks xmlns:a="http://schemas.openxmlformats.org/drawingml/2006/main" noChangeAspect="1"/>
+            </wp:cNvGraphicFramePr>
+            <a:graphic xmlns:a="http://schemas.openxmlformats.org/drawingml/2006/main">
+              <a:graphicData uri="http://schemas.openxmlformats.org/drawingml/2006/picture">
+                <pic:pic xmlns:pic="http://schemas.openxmlformats.org/drawingml/2006/picture">
+                  <pic:nvPicPr>
+                    <pic:cNvPr id="226375215" name="Picture 1" descr="A white background with black text&#10;&#10;AI-generated content may be incorrect."/>
+                    <pic:cNvPicPr/>
+                  </pic:nvPicPr>
+                  <pic:blipFill>
+                    <a:blip r:embed="rId18"/>
+                    <a:stretch>
+                      <a:fillRect/>
+                    </a:stretch>
+                  </pic:blipFill>
+                  <pic:spPr>
+                    <a:xfrm>
+                      <a:off x="0" y="0"/>
+                      <a:ext cx="5731510" cy="1703070"/>
+                    </a:xfrm>
+                    <a:prstGeom prst="rect">
+                      <a:avLst/>
+                    </a:prstGeom>
+                  </pic:spPr>
+                </pic:pic>
+              </a:graphicData>
+            </a:graphic>
+          </wp:inline>
+        </w:drawing>
+      </w:r>
+    </w:p>
+    <w:p/>
+    <w:p>
+      <w:r>
+        <w:drawing>
+          <wp:inline distT="0" distB="0" distL="0" distR="0" wp14:anchorId="0B6FA107" wp14:editId="7C5F096B">
+            <wp:extent cx="5494849" cy="1423358"/>
+            <wp:effectExtent l="0" t="0" r="0" b="5715"/>
+            <wp:docPr id="407482558" name="Picture 1" descr="A white background with black text&#10;&#10;AI-generated content may be incorrect."/>
+            <wp:cNvGraphicFramePr>
+              <a:graphicFrameLocks xmlns:a="http://schemas.openxmlformats.org/drawingml/2006/main" noChangeAspect="1"/>
+            </wp:cNvGraphicFramePr>
+            <a:graphic xmlns:a="http://schemas.openxmlformats.org/drawingml/2006/main">
+              <a:graphicData uri="http://schemas.openxmlformats.org/drawingml/2006/picture">
+                <pic:pic xmlns:pic="http://schemas.openxmlformats.org/drawingml/2006/picture">
+                  <pic:nvPicPr>
+                    <pic:cNvPr id="407482558" name="Picture 1" descr="A white background with black text&#10;&#10;AI-generated content may be incorrect."/>
+                    <pic:cNvPicPr/>
+                  </pic:nvPicPr>
+                  <pic:blipFill>
+                    <a:blip r:embed="rId19"/>
+                    <a:stretch>
+                      <a:fillRect/>
+                    </a:stretch>
+                  </pic:blipFill>
+                  <pic:spPr>
+                    <a:xfrm>
+                      <a:off x="0" y="0"/>
+                      <a:ext cx="5507966" cy="1426756"/>
+                    </a:xfrm>
+                    <a:prstGeom prst="rect">
+                      <a:avLst/>
+                    </a:prstGeom>
+                  </pic:spPr>
+                </pic:pic>
+              </a:graphicData>
+            </a:graphic>
+          </wp:inline>
+        </w:drawing>
+      </w:r>
+    </w:p>
+    <w:p/>
+    <w:p>
+      <w:r>
+        <w:drawing>
+          <wp:inline distT="0" distB="0" distL="0" distR="0" wp14:anchorId="1DE22561" wp14:editId="2CA6B225">
+            <wp:extent cx="5731510" cy="1706880"/>
+            <wp:effectExtent l="0" t="0" r="2540" b="7620"/>
+            <wp:docPr id="970251587" name="Picture 1" descr="A screen shot of a movie&#10;&#10;AI-generated content may be incorrect."/>
+            <wp:cNvGraphicFramePr>
+              <a:graphicFrameLocks xmlns:a="http://schemas.openxmlformats.org/drawingml/2006/main" noChangeAspect="1"/>
+            </wp:cNvGraphicFramePr>
+            <a:graphic xmlns:a="http://schemas.openxmlformats.org/drawingml/2006/main">
+              <a:graphicData uri="http://schemas.openxmlformats.org/drawingml/2006/picture">
+                <pic:pic xmlns:pic="http://schemas.openxmlformats.org/drawingml/2006/picture">
+                  <pic:nvPicPr>
+                    <pic:cNvPr id="970251587" name="Picture 1" descr="A screen shot of a movie&#10;&#10;AI-generated content may be incorrect."/>
+                    <pic:cNvPicPr/>
+                  </pic:nvPicPr>
+                  <pic:blipFill>
+                    <a:blip r:embed="rId20"/>
+                    <a:stretch>
+                      <a:fillRect/>
+                    </a:stretch>
+                  </pic:blipFill>
+                  <pic:spPr>
+                    <a:xfrm>
+                      <a:off x="0" y="0"/>
+                      <a:ext cx="5731510" cy="1706880"/>
+                    </a:xfrm>
+                    <a:prstGeom prst="rect">
+                      <a:avLst/>
+                    </a:prstGeom>
+                  </pic:spPr>
+                </pic:pic>
+              </a:graphicData>
+            </a:graphic>
+          </wp:inline>
+        </w:drawing>
+      </w:r>
+    </w:p>
+    <w:p>
+      <w:r>
+        <w:drawing>
+          <wp:inline distT="0" distB="0" distL="0" distR="0" wp14:anchorId="567BD6E1" wp14:editId="6E166151">
+            <wp:extent cx="5731510" cy="1302589"/>
+            <wp:effectExtent l="0" t="0" r="2540" b="0"/>
+            <wp:docPr id="885650720" name="Picture 1" descr="A close up of a text&#10;&#10;AI-generated content may be incorrect."/>
+            <wp:cNvGraphicFramePr>
+              <a:graphicFrameLocks xmlns:a="http://schemas.openxmlformats.org/drawingml/2006/main" noChangeAspect="1"/>
+            </wp:cNvGraphicFramePr>
+            <a:graphic xmlns:a="http://schemas.openxmlformats.org/drawingml/2006/main">
+              <a:graphicData uri="http://schemas.openxmlformats.org/drawingml/2006/picture">
+                <pic:pic xmlns:pic="http://schemas.openxmlformats.org/drawingml/2006/picture">
+                  <pic:nvPicPr>
+                    <pic:cNvPr id="885650720" name="Picture 1" descr="A close up of a text&#10;&#10;AI-generated content may be incorrect."/>
+                    <pic:cNvPicPr/>
+                  </pic:nvPicPr>
+                  <pic:blipFill>
+                    <a:blip r:embed="rId21"/>
+                    <a:stretch>
+                      <a:fillRect/>
+                    </a:stretch>
+                  </pic:blipFill>
+                  <pic:spPr>
+                    <a:xfrm>
+                      <a:off x="0" y="0"/>
+                      <a:ext cx="5737152" cy="1303871"/>
+                    </a:xfrm>
+                    <a:prstGeom prst="rect">
+                      <a:avLst/>
+                    </a:prstGeom>
+                  </pic:spPr>
+                </pic:pic>
+              </a:graphicData>
+            </a:graphic>
+          </wp:inline>
+        </w:drawing>
+      </w:r>
+    </w:p>
+    <w:p/>
+    <w:p>
+      <w:r>
+        <w:drawing>
+          <wp:inline distT="0" distB="0" distL="0" distR="0" wp14:anchorId="178004D1" wp14:editId="2AF8463C">
+            <wp:extent cx="5731510" cy="3091815"/>
+            <wp:effectExtent l="0" t="0" r="2540" b="0"/>
+            <wp:docPr id="76550570" name="Picture 1" descr="A screen shot of a computer program&#10;&#10;AI-generated content may be incorrect."/>
+            <wp:cNvGraphicFramePr>
+              <a:graphicFrameLocks xmlns:a="http://schemas.openxmlformats.org/drawingml/2006/main" noChangeAspect="1"/>
+            </wp:cNvGraphicFramePr>
+            <a:graphic xmlns:a="http://schemas.openxmlformats.org/drawingml/2006/main">
+              <a:graphicData uri="http://schemas.openxmlformats.org/drawingml/2006/picture">
+                <pic:pic xmlns:pic="http://schemas.openxmlformats.org/drawingml/2006/picture">
+                  <pic:nvPicPr>
+                    <pic:cNvPr id="76550570" name="Picture 1" descr="A screen shot of a computer program&#10;&#10;AI-generated content may be incorrect."/>
+                    <pic:cNvPicPr/>
+                  </pic:nvPicPr>
+                  <pic:blipFill>
+                    <a:blip r:embed="rId22"/>
+                    <a:stretch>
+                      <a:fillRect/>
+                    </a:stretch>
+                  </pic:blipFill>
+                  <pic:spPr>
+                    <a:xfrm>
+                      <a:off x="0" y="0"/>
+                      <a:ext cx="5731510" cy="3091815"/>
+                    </a:xfrm>
+                    <a:prstGeom prst="rect">
+                      <a:avLst/>
+                    </a:prstGeom>
+                  </pic:spPr>
+                </pic:pic>
+              </a:graphicData>
+            </a:graphic>
+          </wp:inline>
+        </w:drawing>
+      </w:r>
+    </w:p>
+    <w:p>
+      <w:r>
+        <w:drawing>
+          <wp:inline distT="0" distB="0" distL="0" distR="0" wp14:anchorId="1DC88967" wp14:editId="48FAA321">
+            <wp:extent cx="3972479" cy="1924319"/>
+            <wp:effectExtent l="0" t="0" r="0" b="0"/>
+            <wp:docPr id="818487879" name="Picture 1" descr="A black screen with white text&#10;&#10;AI-generated content may be incorrect."/>
+            <wp:cNvGraphicFramePr>
+              <a:graphicFrameLocks xmlns:a="http://schemas.openxmlformats.org/drawingml/2006/main" noChangeAspect="1"/>
+            </wp:cNvGraphicFramePr>
+            <a:graphic xmlns:a="http://schemas.openxmlformats.org/drawingml/2006/main">
+              <a:graphicData uri="http://schemas.openxmlformats.org/drawingml/2006/picture">
+                <pic:pic xmlns:pic="http://schemas.openxmlformats.org/drawingml/2006/picture">
+                  <pic:nvPicPr>
+                    <pic:cNvPr id="818487879" name="Picture 1" descr="A black screen with white text&#10;&#10;AI-generated content may be incorrect."/>
+                    <pic:cNvPicPr/>
+                  </pic:nvPicPr>
+                  <pic:blipFill>
+                    <a:blip r:embed="rId23"/>
+                    <a:stretch>
+                      <a:fillRect/>
+                    </a:stretch>
+                  </pic:blipFill>
+                  <pic:spPr>
+                    <a:xfrm>
+                      <a:off x="0" y="0"/>
+                      <a:ext cx="3972479" cy="1924319"/>
+                    </a:xfrm>
+                    <a:prstGeom prst="rect">
+                      <a:avLst/>
+                    </a:prstGeom>
+                  </pic:spPr>
+                </pic:pic>
+              </a:graphicData>
+            </a:graphic>
+          </wp:inline>
+        </w:drawing>
+      </w:r>
+    </w:p>
+    <w:p/>
+    <w:p>
+      <w:r>
+        <w:drawing>
+          <wp:inline distT="0" distB="0" distL="0" distR="0" wp14:anchorId="30167D86" wp14:editId="69DA52B9">
+            <wp:extent cx="4096322" cy="2257740"/>
+            <wp:effectExtent l="0" t="0" r="0" b="9525"/>
+            <wp:docPr id="908513375" name="Picture 1"/>
+            <wp:cNvGraphicFramePr>
+              <a:graphicFrameLocks xmlns:a="http://schemas.openxmlformats.org/drawingml/2006/main" noChangeAspect="1"/>
+            </wp:cNvGraphicFramePr>
+            <a:graphic xmlns:a="http://schemas.openxmlformats.org/drawingml/2006/main">
+              <a:graphicData uri="http://schemas.openxmlformats.org/drawingml/2006/picture">
+                <pic:pic xmlns:pic="http://schemas.openxmlformats.org/drawingml/2006/picture">
+                  <pic:nvPicPr>
+                    <pic:cNvPr id="908513375" name=""/>
+                    <pic:cNvPicPr/>
+                  </pic:nvPicPr>
+                  <pic:blipFill>
+                    <a:blip r:embed="rId24"/>
+                    <a:stretch>
+                      <a:fillRect/>
+                    </a:stretch>
+                  </pic:blipFill>
+                  <pic:spPr>
+                    <a:xfrm>
+                      <a:off x="0" y="0"/>
+                      <a:ext cx="4096322" cy="2257740"/>
+                    </a:xfrm>
+                    <a:prstGeom prst="rect">
+                      <a:avLst/>
+                    </a:prstGeom>
+                  </pic:spPr>
+                </pic:pic>
+              </a:graphicData>
+            </a:graphic>
+          </wp:inline>
+        </w:drawing>
+      </w:r>
+    </w:p>
     <w:p/>
     <w:p/>
     <w:p/>

</xml_diff>

<commit_message>
document loader moved to RAG Project
</commit_message>
<xml_diff>
--- a/GenAI by Sheryians Notes.docx
+++ b/GenAI by Sheryians Notes.docx
@@ -1948,6 +1948,9 @@
     <w:p/>
     <w:p/>
     <w:p>
+      <w:pPr>
+        <w:pStyle w:val="Heading2"/>
+      </w:pPr>
       <w:r>
         <w:t>RAG – Document Loader:</w:t>
       </w:r>
@@ -1955,6 +1958,9 @@
     <w:p/>
     <w:p>
       <w:r>
+        <w:rPr>
+          <w:noProof/>
+        </w:rPr>
         <w:drawing>
           <wp:inline distT="0" distB="0" distL="0" distR="0" wp14:anchorId="77B92906" wp14:editId="7702E4C2">
             <wp:extent cx="5731510" cy="1982470"/>
@@ -1992,6 +1998,436 @@
         </w:drawing>
       </w:r>
     </w:p>
+    <w:p>
+      <w:r>
+        <w:t xml:space="preserve">Testing </w:t>
+      </w:r>
+      <w:r>
+        <w:t>Loaded</w:t>
+      </w:r>
+      <w:r>
+        <w:t xml:space="preserve"> Only:</w:t>
+      </w:r>
+    </w:p>
+    <w:p>
+      <w:r>
+        <w:drawing>
+          <wp:inline distT="0" distB="0" distL="0" distR="0" wp14:anchorId="4BE20415" wp14:editId="38C36B87">
+            <wp:extent cx="4972744" cy="1552792"/>
+            <wp:effectExtent l="0" t="0" r="0" b="9525"/>
+            <wp:docPr id="1052070939" name="Picture 1"/>
+            <wp:cNvGraphicFramePr>
+              <a:graphicFrameLocks xmlns:a="http://schemas.openxmlformats.org/drawingml/2006/main" noChangeAspect="1"/>
+            </wp:cNvGraphicFramePr>
+            <a:graphic xmlns:a="http://schemas.openxmlformats.org/drawingml/2006/main">
+              <a:graphicData uri="http://schemas.openxmlformats.org/drawingml/2006/picture">
+                <pic:pic xmlns:pic="http://schemas.openxmlformats.org/drawingml/2006/picture">
+                  <pic:nvPicPr>
+                    <pic:cNvPr id="1052070939" name=""/>
+                    <pic:cNvPicPr/>
+                  </pic:nvPicPr>
+                  <pic:blipFill>
+                    <a:blip r:embed="rId41"/>
+                    <a:stretch>
+                      <a:fillRect/>
+                    </a:stretch>
+                  </pic:blipFill>
+                  <pic:spPr>
+                    <a:xfrm>
+                      <a:off x="0" y="0"/>
+                      <a:ext cx="4972744" cy="1552792"/>
+                    </a:xfrm>
+                    <a:prstGeom prst="rect">
+                      <a:avLst/>
+                    </a:prstGeom>
+                  </pic:spPr>
+                </pic:pic>
+              </a:graphicData>
+            </a:graphic>
+          </wp:inline>
+        </w:drawing>
+      </w:r>
+    </w:p>
+    <w:p>
+      <w:pPr>
+        <w:pStyle w:val="ListParagraph"/>
+        <w:numPr>
+          <w:ilvl w:val="0"/>
+          <w:numId w:val="4"/>
+        </w:numPr>
+      </w:pPr>
+      <w:r>
+        <w:rPr>
+          <w:b/>
+          <w:bCs/>
+        </w:rPr>
+        <w:t>Community Text/File Loaders</w:t>
+      </w:r>
+      <w:r>
+        <w:t xml:space="preserve">: </w:t>
+      </w:r>
+      <w:r>
+        <w:t>(langchain_community)</w:t>
+      </w:r>
+    </w:p>
+    <w:p>
+      <w:pPr>
+        <w:ind w:left="720"/>
+      </w:pPr>
+      <w:r>
+        <w:t>Plain text files (.txt), simple single-column documents, fast prototyping.</w:t>
+      </w:r>
+    </w:p>
+    <w:p/>
+    <w:p>
+      <w:pPr>
+        <w:pStyle w:val="ListParagraph"/>
+        <w:numPr>
+          <w:ilvl w:val="0"/>
+          <w:numId w:val="4"/>
+        </w:numPr>
+        <w:rPr>
+          <w:b/>
+          <w:bCs/>
+        </w:rPr>
+      </w:pPr>
+      <w:r>
+        <w:rPr>
+          <w:b/>
+          <w:bCs/>
+        </w:rPr>
+        <w:t>LangChain Docling Loader (DoclingLoader</w:t>
+      </w:r>
+      <w:r>
+        <w:rPr>
+          <w:b/>
+          <w:bCs/>
+        </w:rPr>
+        <w:t>)</w:t>
+      </w:r>
+    </w:p>
+    <w:p>
+      <w:pPr>
+        <w:ind w:left="720"/>
+      </w:pPr>
+      <w:r>
+        <w:t>Complex PDFs, financial reports with tables, multi-column layouts, presentations.</w:t>
+      </w:r>
+    </w:p>
+    <w:p>
+      <w:pPr>
+        <w:rPr>
+          <w:b/>
+          <w:bCs/>
+        </w:rPr>
+      </w:pPr>
+    </w:p>
+    <w:p>
+      <w:pPr>
+        <w:rPr>
+          <w:b/>
+          <w:bCs/>
+        </w:rPr>
+      </w:pPr>
+      <w:r>
+        <w:rPr>
+          <w:b/>
+          <w:bCs/>
+        </w:rPr>
+        <w:t>Embedding enabled due to Format support issue</w:t>
+      </w:r>
+    </w:p>
+    <w:p>
+      <w:pPr>
+        <w:rPr>
+          <w:b/>
+          <w:bCs/>
+        </w:rPr>
+      </w:pPr>
+      <w:r>
+        <w:rPr>
+          <w:b/>
+          <w:bCs/>
+        </w:rPr>
+        <w:drawing>
+          <wp:inline distT="0" distB="0" distL="0" distR="0" wp14:anchorId="143F021A" wp14:editId="6304C97D">
+            <wp:extent cx="5731510" cy="1610995"/>
+            <wp:effectExtent l="0" t="0" r="2540" b="8255"/>
+            <wp:docPr id="1914182533" name="Picture 1"/>
+            <wp:cNvGraphicFramePr>
+              <a:graphicFrameLocks xmlns:a="http://schemas.openxmlformats.org/drawingml/2006/main" noChangeAspect="1"/>
+            </wp:cNvGraphicFramePr>
+            <a:graphic xmlns:a="http://schemas.openxmlformats.org/drawingml/2006/main">
+              <a:graphicData uri="http://schemas.openxmlformats.org/drawingml/2006/picture">
+                <pic:pic xmlns:pic="http://schemas.openxmlformats.org/drawingml/2006/picture">
+                  <pic:nvPicPr>
+                    <pic:cNvPr id="1914182533" name=""/>
+                    <pic:cNvPicPr/>
+                  </pic:nvPicPr>
+                  <pic:blipFill>
+                    <a:blip r:embed="rId42"/>
+                    <a:stretch>
+                      <a:fillRect/>
+                    </a:stretch>
+                  </pic:blipFill>
+                  <pic:spPr>
+                    <a:xfrm>
+                      <a:off x="0" y="0"/>
+                      <a:ext cx="5731510" cy="1610995"/>
+                    </a:xfrm>
+                    <a:prstGeom prst="rect">
+                      <a:avLst/>
+                    </a:prstGeom>
+                  </pic:spPr>
+                </pic:pic>
+              </a:graphicData>
+            </a:graphic>
+          </wp:inline>
+        </w:drawing>
+      </w:r>
+    </w:p>
+    <w:p>
+      <w:pPr>
+        <w:rPr>
+          <w:b/>
+          <w:bCs/>
+        </w:rPr>
+      </w:pPr>
+      <w:r>
+        <w:rPr>
+          <w:b/>
+          <w:bCs/>
+        </w:rPr>
+        <w:lastRenderedPageBreak/>
+        <w:t>It shows Metadata and Page Content</w:t>
+      </w:r>
+      <w:r>
+        <w:rPr>
+          <w:b/>
+          <w:bCs/>
+        </w:rPr>
+        <w:t>. Output is received in List</w:t>
+      </w:r>
+    </w:p>
+    <w:p>
+      <w:pPr>
+        <w:rPr>
+          <w:b/>
+          <w:bCs/>
+        </w:rPr>
+      </w:pPr>
+    </w:p>
+    <w:p>
+      <w:pPr>
+        <w:rPr>
+          <w:b/>
+          <w:bCs/>
+        </w:rPr>
+      </w:pPr>
+      <w:r>
+        <w:rPr>
+          <w:b/>
+          <w:bCs/>
+        </w:rPr>
+        <w:drawing>
+          <wp:inline distT="0" distB="0" distL="0" distR="0" wp14:anchorId="06D7709B" wp14:editId="4E98AA49">
+            <wp:extent cx="5731510" cy="873760"/>
+            <wp:effectExtent l="0" t="0" r="2540" b="2540"/>
+            <wp:docPr id="743151489" name="Picture 1"/>
+            <wp:cNvGraphicFramePr>
+              <a:graphicFrameLocks xmlns:a="http://schemas.openxmlformats.org/drawingml/2006/main" noChangeAspect="1"/>
+            </wp:cNvGraphicFramePr>
+            <a:graphic xmlns:a="http://schemas.openxmlformats.org/drawingml/2006/main">
+              <a:graphicData uri="http://schemas.openxmlformats.org/drawingml/2006/picture">
+                <pic:pic xmlns:pic="http://schemas.openxmlformats.org/drawingml/2006/picture">
+                  <pic:nvPicPr>
+                    <pic:cNvPr id="743151489" name=""/>
+                    <pic:cNvPicPr/>
+                  </pic:nvPicPr>
+                  <pic:blipFill>
+                    <a:blip r:embed="rId43"/>
+                    <a:stretch>
+                      <a:fillRect/>
+                    </a:stretch>
+                  </pic:blipFill>
+                  <pic:spPr>
+                    <a:xfrm>
+                      <a:off x="0" y="0"/>
+                      <a:ext cx="5731510" cy="873760"/>
+                    </a:xfrm>
+                    <a:prstGeom prst="rect">
+                      <a:avLst/>
+                    </a:prstGeom>
+                  </pic:spPr>
+                </pic:pic>
+              </a:graphicData>
+            </a:graphic>
+          </wp:inline>
+        </w:drawing>
+      </w:r>
+    </w:p>
+    <w:p>
+      <w:pPr>
+        <w:rPr>
+          <w:b/>
+          <w:bCs/>
+        </w:rPr>
+      </w:pPr>
+    </w:p>
+    <w:p>
+      <w:pPr>
+        <w:rPr>
+          <w:b/>
+          <w:bCs/>
+        </w:rPr>
+      </w:pPr>
+      <w:r>
+        <w:rPr>
+          <w:b/>
+          <w:bCs/>
+        </w:rPr>
+        <w:drawing>
+          <wp:inline distT="0" distB="0" distL="0" distR="0" wp14:anchorId="15DBD740" wp14:editId="2DDD5D43">
+            <wp:extent cx="3829584" cy="1752845"/>
+            <wp:effectExtent l="0" t="0" r="0" b="0"/>
+            <wp:docPr id="2005437159" name="Picture 1"/>
+            <wp:cNvGraphicFramePr>
+              <a:graphicFrameLocks xmlns:a="http://schemas.openxmlformats.org/drawingml/2006/main" noChangeAspect="1"/>
+            </wp:cNvGraphicFramePr>
+            <a:graphic xmlns:a="http://schemas.openxmlformats.org/drawingml/2006/main">
+              <a:graphicData uri="http://schemas.openxmlformats.org/drawingml/2006/picture">
+                <pic:pic xmlns:pic="http://schemas.openxmlformats.org/drawingml/2006/picture">
+                  <pic:nvPicPr>
+                    <pic:cNvPr id="2005437159" name=""/>
+                    <pic:cNvPicPr/>
+                  </pic:nvPicPr>
+                  <pic:blipFill>
+                    <a:blip r:embed="rId44"/>
+                    <a:stretch>
+                      <a:fillRect/>
+                    </a:stretch>
+                  </pic:blipFill>
+                  <pic:spPr>
+                    <a:xfrm>
+                      <a:off x="0" y="0"/>
+                      <a:ext cx="3829584" cy="1752845"/>
+                    </a:xfrm>
+                    <a:prstGeom prst="rect">
+                      <a:avLst/>
+                    </a:prstGeom>
+                  </pic:spPr>
+                </pic:pic>
+              </a:graphicData>
+            </a:graphic>
+          </wp:inline>
+        </w:drawing>
+      </w:r>
+    </w:p>
+    <w:p>
+      <w:pPr>
+        <w:rPr>
+          <w:b/>
+          <w:bCs/>
+        </w:rPr>
+      </w:pPr>
+    </w:p>
+    <w:p>
+      <w:pPr>
+        <w:rPr>
+          <w:b/>
+          <w:bCs/>
+        </w:rPr>
+      </w:pPr>
+    </w:p>
+    <w:p>
+      <w:pPr>
+        <w:rPr>
+          <w:b/>
+          <w:bCs/>
+        </w:rPr>
+      </w:pPr>
+    </w:p>
+    <w:p>
+      <w:pPr>
+        <w:rPr>
+          <w:b/>
+          <w:bCs/>
+        </w:rPr>
+      </w:pPr>
+    </w:p>
+    <w:p>
+      <w:pPr>
+        <w:rPr>
+          <w:b/>
+          <w:bCs/>
+        </w:rPr>
+      </w:pPr>
+    </w:p>
+    <w:p>
+      <w:pPr>
+        <w:rPr>
+          <w:b/>
+          <w:bCs/>
+        </w:rPr>
+      </w:pPr>
+    </w:p>
+    <w:p>
+      <w:pPr>
+        <w:rPr>
+          <w:b/>
+          <w:bCs/>
+        </w:rPr>
+      </w:pPr>
+    </w:p>
+    <w:p>
+      <w:pPr>
+        <w:rPr>
+          <w:b/>
+          <w:bCs/>
+        </w:rPr>
+      </w:pPr>
+      <w:r>
+        <w:rPr>
+          <w:b/>
+          <w:bCs/>
+        </w:rPr>
+        <w:drawing>
+          <wp:inline distT="0" distB="0" distL="0" distR="0" wp14:anchorId="4CF5477E" wp14:editId="37848569">
+            <wp:extent cx="5731510" cy="2761615"/>
+            <wp:effectExtent l="0" t="0" r="2540" b="635"/>
+            <wp:docPr id="666477920" name="Picture 1"/>
+            <wp:cNvGraphicFramePr>
+              <a:graphicFrameLocks xmlns:a="http://schemas.openxmlformats.org/drawingml/2006/main" noChangeAspect="1"/>
+            </wp:cNvGraphicFramePr>
+            <a:graphic xmlns:a="http://schemas.openxmlformats.org/drawingml/2006/main">
+              <a:graphicData uri="http://schemas.openxmlformats.org/drawingml/2006/picture">
+                <pic:pic xmlns:pic="http://schemas.openxmlformats.org/drawingml/2006/picture">
+                  <pic:nvPicPr>
+                    <pic:cNvPr id="666477920" name=""/>
+                    <pic:cNvPicPr/>
+                  </pic:nvPicPr>
+                  <pic:blipFill>
+                    <a:blip r:embed="rId45"/>
+                    <a:stretch>
+                      <a:fillRect/>
+                    </a:stretch>
+                  </pic:blipFill>
+                  <pic:spPr>
+                    <a:xfrm>
+                      <a:off x="0" y="0"/>
+                      <a:ext cx="5731510" cy="2761615"/>
+                    </a:xfrm>
+                    <a:prstGeom prst="rect">
+                      <a:avLst/>
+                    </a:prstGeom>
+                  </pic:spPr>
+                </pic:pic>
+              </a:graphicData>
+            </a:graphic>
+          </wp:inline>
+        </w:drawing>
+      </w:r>
+    </w:p>
     <w:p/>
     <w:p/>
     <w:p>
@@ -2163,6 +2599,119 @@
     </w:lvl>
   </w:abstractNum>
   <w:abstractNum w:abstractNumId="1" w15:restartNumberingAfterBreak="0">
+    <w:nsid w:val="28F45D7F"/>
+    <w:multiLevelType w:val="hybridMultilevel"/>
+    <w:tmpl w:val="28943950"/>
+    <w:lvl w:ilvl="0" w:tplc="08090001">
+      <w:start w:val="1"/>
+      <w:numFmt w:val="bullet"/>
+      <w:lvlText w:val=""/>
+      <w:lvlJc w:val="left"/>
+      <w:pPr>
+        <w:ind w:left="720" w:hanging="360"/>
+      </w:pPr>
+      <w:rPr>
+        <w:rFonts w:ascii="Symbol" w:hAnsi="Symbol" w:hint="default"/>
+      </w:rPr>
+    </w:lvl>
+    <w:lvl w:ilvl="1" w:tplc="08090003">
+      <w:start w:val="1"/>
+      <w:numFmt w:val="bullet"/>
+      <w:lvlText w:val="o"/>
+      <w:lvlJc w:val="left"/>
+      <w:pPr>
+        <w:ind w:left="1440" w:hanging="360"/>
+      </w:pPr>
+      <w:rPr>
+        <w:rFonts w:ascii="Courier New" w:hAnsi="Courier New" w:cs="Courier New" w:hint="default"/>
+      </w:rPr>
+    </w:lvl>
+    <w:lvl w:ilvl="2" w:tplc="08090005" w:tentative="1">
+      <w:start w:val="1"/>
+      <w:numFmt w:val="bullet"/>
+      <w:lvlText w:val=""/>
+      <w:lvlJc w:val="left"/>
+      <w:pPr>
+        <w:ind w:left="2160" w:hanging="360"/>
+      </w:pPr>
+      <w:rPr>
+        <w:rFonts w:ascii="Wingdings" w:hAnsi="Wingdings" w:hint="default"/>
+      </w:rPr>
+    </w:lvl>
+    <w:lvl w:ilvl="3" w:tplc="08090001" w:tentative="1">
+      <w:start w:val="1"/>
+      <w:numFmt w:val="bullet"/>
+      <w:lvlText w:val=""/>
+      <w:lvlJc w:val="left"/>
+      <w:pPr>
+        <w:ind w:left="2880" w:hanging="360"/>
+      </w:pPr>
+      <w:rPr>
+        <w:rFonts w:ascii="Symbol" w:hAnsi="Symbol" w:hint="default"/>
+      </w:rPr>
+    </w:lvl>
+    <w:lvl w:ilvl="4" w:tplc="08090003" w:tentative="1">
+      <w:start w:val="1"/>
+      <w:numFmt w:val="bullet"/>
+      <w:lvlText w:val="o"/>
+      <w:lvlJc w:val="left"/>
+      <w:pPr>
+        <w:ind w:left="3600" w:hanging="360"/>
+      </w:pPr>
+      <w:rPr>
+        <w:rFonts w:ascii="Courier New" w:hAnsi="Courier New" w:cs="Courier New" w:hint="default"/>
+      </w:rPr>
+    </w:lvl>
+    <w:lvl w:ilvl="5" w:tplc="08090005" w:tentative="1">
+      <w:start w:val="1"/>
+      <w:numFmt w:val="bullet"/>
+      <w:lvlText w:val=""/>
+      <w:lvlJc w:val="left"/>
+      <w:pPr>
+        <w:ind w:left="4320" w:hanging="360"/>
+      </w:pPr>
+      <w:rPr>
+        <w:rFonts w:ascii="Wingdings" w:hAnsi="Wingdings" w:hint="default"/>
+      </w:rPr>
+    </w:lvl>
+    <w:lvl w:ilvl="6" w:tplc="08090001" w:tentative="1">
+      <w:start w:val="1"/>
+      <w:numFmt w:val="bullet"/>
+      <w:lvlText w:val=""/>
+      <w:lvlJc w:val="left"/>
+      <w:pPr>
+        <w:ind w:left="5040" w:hanging="360"/>
+      </w:pPr>
+      <w:rPr>
+        <w:rFonts w:ascii="Symbol" w:hAnsi="Symbol" w:hint="default"/>
+      </w:rPr>
+    </w:lvl>
+    <w:lvl w:ilvl="7" w:tplc="08090003" w:tentative="1">
+      <w:start w:val="1"/>
+      <w:numFmt w:val="bullet"/>
+      <w:lvlText w:val="o"/>
+      <w:lvlJc w:val="left"/>
+      <w:pPr>
+        <w:ind w:left="5760" w:hanging="360"/>
+      </w:pPr>
+      <w:rPr>
+        <w:rFonts w:ascii="Courier New" w:hAnsi="Courier New" w:cs="Courier New" w:hint="default"/>
+      </w:rPr>
+    </w:lvl>
+    <w:lvl w:ilvl="8" w:tplc="08090005" w:tentative="1">
+      <w:start w:val="1"/>
+      <w:numFmt w:val="bullet"/>
+      <w:lvlText w:val=""/>
+      <w:lvlJc w:val="left"/>
+      <w:pPr>
+        <w:ind w:left="6480" w:hanging="360"/>
+      </w:pPr>
+      <w:rPr>
+        <w:rFonts w:ascii="Wingdings" w:hAnsi="Wingdings" w:hint="default"/>
+      </w:rPr>
+    </w:lvl>
+  </w:abstractNum>
+  <w:abstractNum w:abstractNumId="2" w15:restartNumberingAfterBreak="0">
     <w:nsid w:val="3E464BBD"/>
     <w:multiLevelType w:val="multilevel"/>
     <w:tmpl w:val="ABF8B8AA"/>
@@ -2311,7 +2860,7 @@
       </w:rPr>
     </w:lvl>
   </w:abstractNum>
-  <w:abstractNum w:abstractNumId="2" w15:restartNumberingAfterBreak="0">
+  <w:abstractNum w:abstractNumId="3" w15:restartNumberingAfterBreak="0">
     <w:nsid w:val="79A33BB0"/>
     <w:multiLevelType w:val="multilevel"/>
     <w:tmpl w:val="284C731C"/>
@@ -2461,13 +3010,16 @@
     </w:lvl>
   </w:abstractNum>
   <w:num w:numId="1" w16cid:durableId="1274479537">
-    <w:abstractNumId w:val="2"/>
+    <w:abstractNumId w:val="3"/>
   </w:num>
   <w:num w:numId="2" w16cid:durableId="1753239972">
-    <w:abstractNumId w:val="1"/>
+    <w:abstractNumId w:val="2"/>
   </w:num>
   <w:num w:numId="3" w16cid:durableId="1283418227">
     <w:abstractNumId w:val="0"/>
+  </w:num>
+  <w:num w:numId="4" w16cid:durableId="1967538878">
+    <w:abstractNumId w:val="1"/>
   </w:num>
 </w:numbering>
 </file>
@@ -2900,7 +3452,6 @@
     <w:next w:val="Normal"/>
     <w:link w:val="Heading2Char"/>
     <w:uiPriority w:val="9"/>
-    <w:semiHidden/>
     <w:unhideWhenUsed/>
     <w:qFormat/>
     <w:rsid w:val="009C4757"/>
@@ -3075,7 +3626,6 @@
   <w:style w:type="character" w:default="1" w:styleId="DefaultParagraphFont">
     <w:name w:val="Default Paragraph Font"/>
     <w:uiPriority w:val="1"/>
-    <w:semiHidden/>
     <w:unhideWhenUsed/>
   </w:style>
   <w:style w:type="table" w:default="1" w:styleId="TableNormal">
@@ -3117,7 +3667,6 @@
     <w:basedOn w:val="DefaultParagraphFont"/>
     <w:link w:val="Heading2"/>
     <w:uiPriority w:val="9"/>
-    <w:semiHidden/>
     <w:rsid w:val="009C4757"/>
     <w:rPr>
       <w:rFonts w:asciiTheme="majorHAnsi" w:eastAsiaTheme="majorEastAsia" w:hAnsiTheme="majorHAnsi" w:cstheme="majorBidi"/>

</xml_diff>

<commit_message>
pdf loader in RAG
</commit_message>
<xml_diff>
--- a/GenAI by Sheryians Notes.docx
+++ b/GenAI by Sheryians Notes.docx
@@ -2845,12 +2845,384 @@
           <w:lang w:val="en-US"/>
         </w:rPr>
       </w:pPr>
-      <w:r>
-        <w:rPr>
-          <w:lang w:val="en-US"/>
-        </w:rPr>
-        <w:t>https://github.com/langchain-ai/langchain-community/issues/674</w:t>
-      </w:r>
+      <w:hyperlink r:id="rId47" w:history="1">
+        <w:r>
+          <w:rPr>
+            <w:rStyle w:val="Hyperlink"/>
+            <w:lang w:val="en-US"/>
+          </w:rPr>
+          <w:t>https://github.com/langchain-ai/langchain-community/issues/674</w:t>
+        </w:r>
+      </w:hyperlink>
+    </w:p>
+    <w:p>
+      <w:pPr>
+        <w:rPr>
+          <w:lang w:val="en-US"/>
+        </w:rPr>
+      </w:pPr>
+    </w:p>
+    <w:p>
+      <w:pPr>
+        <w:rPr>
+          <w:lang w:val="en-US"/>
+        </w:rPr>
+      </w:pPr>
+    </w:p>
+    <w:p>
+      <w:pPr>
+        <w:rPr>
+          <w:lang w:val="en-US"/>
+        </w:rPr>
+      </w:pPr>
+    </w:p>
+    <w:p>
+      <w:pPr>
+        <w:rPr>
+          <w:lang w:val="en-US"/>
+        </w:rPr>
+      </w:pPr>
+    </w:p>
+    <w:p>
+      <w:pPr>
+        <w:rPr>
+          <w:lang w:val="en-US"/>
+        </w:rPr>
+      </w:pPr>
+    </w:p>
+    <w:p>
+      <w:pPr>
+        <w:rPr>
+          <w:b/>
+          <w:bCs/>
+          <w:lang w:val="en-US"/>
+        </w:rPr>
+      </w:pPr>
+      <w:r>
+        <w:rPr>
+          <w:b/>
+          <w:bCs/>
+          <w:lang w:val="en-US"/>
+        </w:rPr>
+        <w:lastRenderedPageBreak/>
+        <w:t>Loading PDF Document to LLM Model:</w:t>
+      </w:r>
+    </w:p>
+    <w:p>
+      <w:pPr>
+        <w:rPr>
+          <w:b/>
+          <w:bCs/>
+          <w:lang w:val="en-US"/>
+        </w:rPr>
+      </w:pPr>
+      <w:r>
+        <w:rPr>
+          <w:lang w:val="en-US"/>
+        </w:rPr>
+        <w:t xml:space="preserve">Only </w:t>
+      </w:r>
+      <w:r>
+        <w:rPr>
+          <w:lang w:val="en-US"/>
+        </w:rPr>
+        <w:t>pdf library and file path need to change</w:t>
+      </w:r>
+      <w:r>
+        <w:rPr>
+          <w:b/>
+          <w:bCs/>
+          <w:lang w:val="en-US"/>
+        </w:rPr>
+        <w:t>.</w:t>
+      </w:r>
+    </w:p>
+    <w:p>
+      <w:pPr>
+        <w:rPr>
+          <w:b/>
+          <w:bCs/>
+          <w:lang w:val="en-US"/>
+        </w:rPr>
+      </w:pPr>
+      <w:r>
+        <w:rPr>
+          <w:b/>
+          <w:bCs/>
+          <w:noProof/>
+          <w:lang w:val="en-US"/>
+        </w:rPr>
+        <w:drawing>
+          <wp:inline distT="0" distB="0" distL="0" distR="0" wp14:anchorId="2A55009B" wp14:editId="107374EC">
+            <wp:extent cx="5731510" cy="2941955"/>
+            <wp:effectExtent l="0" t="0" r="2540" b="0"/>
+            <wp:docPr id="604461601" name="Picture 1"/>
+            <wp:cNvGraphicFramePr>
+              <a:graphicFrameLocks xmlns:a="http://schemas.openxmlformats.org/drawingml/2006/main" noChangeAspect="1"/>
+            </wp:cNvGraphicFramePr>
+            <a:graphic xmlns:a="http://schemas.openxmlformats.org/drawingml/2006/main">
+              <a:graphicData uri="http://schemas.openxmlformats.org/drawingml/2006/picture">
+                <pic:pic xmlns:pic="http://schemas.openxmlformats.org/drawingml/2006/picture">
+                  <pic:nvPicPr>
+                    <pic:cNvPr id="604461601" name=""/>
+                    <pic:cNvPicPr/>
+                  </pic:nvPicPr>
+                  <pic:blipFill>
+                    <a:blip r:embed="rId48"/>
+                    <a:stretch>
+                      <a:fillRect/>
+                    </a:stretch>
+                  </pic:blipFill>
+                  <pic:spPr>
+                    <a:xfrm>
+                      <a:off x="0" y="0"/>
+                      <a:ext cx="5731510" cy="2941955"/>
+                    </a:xfrm>
+                    <a:prstGeom prst="rect">
+                      <a:avLst/>
+                    </a:prstGeom>
+                  </pic:spPr>
+                </pic:pic>
+              </a:graphicData>
+            </a:graphic>
+          </wp:inline>
+        </w:drawing>
+      </w:r>
+    </w:p>
+    <w:p>
+      <w:pPr>
+        <w:rPr>
+          <w:b/>
+          <w:bCs/>
+          <w:lang w:val="en-US"/>
+        </w:rPr>
+      </w:pPr>
+    </w:p>
+    <w:p>
+      <w:pPr>
+        <w:rPr>
+          <w:b/>
+          <w:bCs/>
+          <w:lang w:val="en-US"/>
+        </w:rPr>
+      </w:pPr>
+    </w:p>
+    <w:p>
+      <w:pPr>
+        <w:rPr>
+          <w:b/>
+          <w:bCs/>
+          <w:lang w:val="en-US"/>
+        </w:rPr>
+      </w:pPr>
+      <w:r>
+        <w:rPr>
+          <w:b/>
+          <w:bCs/>
+          <w:lang w:val="en-US"/>
+        </w:rPr>
+        <w:t>Text Splitter and Chunking</w:t>
+      </w:r>
+    </w:p>
+    <w:p>
+      <w:pPr>
+        <w:rPr>
+          <w:b/>
+          <w:bCs/>
+          <w:lang w:val="en-US"/>
+        </w:rPr>
+      </w:pPr>
+    </w:p>
+    <w:p>
+      <w:pPr>
+        <w:rPr>
+          <w:b/>
+          <w:bCs/>
+          <w:lang w:val="en-US"/>
+        </w:rPr>
+      </w:pPr>
+      <w:r>
+        <w:rPr>
+          <w:b/>
+          <w:bCs/>
+          <w:noProof/>
+          <w:lang w:val="en-US"/>
+        </w:rPr>
+        <w:drawing>
+          <wp:inline distT="0" distB="0" distL="0" distR="0" wp14:anchorId="56E61256" wp14:editId="535A42E2">
+            <wp:extent cx="5525271" cy="3734321"/>
+            <wp:effectExtent l="0" t="0" r="0" b="0"/>
+            <wp:docPr id="1087232936" name="Picture 1"/>
+            <wp:cNvGraphicFramePr>
+              <a:graphicFrameLocks xmlns:a="http://schemas.openxmlformats.org/drawingml/2006/main" noChangeAspect="1"/>
+            </wp:cNvGraphicFramePr>
+            <a:graphic xmlns:a="http://schemas.openxmlformats.org/drawingml/2006/main">
+              <a:graphicData uri="http://schemas.openxmlformats.org/drawingml/2006/picture">
+                <pic:pic xmlns:pic="http://schemas.openxmlformats.org/drawingml/2006/picture">
+                  <pic:nvPicPr>
+                    <pic:cNvPr id="1087232936" name=""/>
+                    <pic:cNvPicPr/>
+                  </pic:nvPicPr>
+                  <pic:blipFill>
+                    <a:blip r:embed="rId49"/>
+                    <a:stretch>
+                      <a:fillRect/>
+                    </a:stretch>
+                  </pic:blipFill>
+                  <pic:spPr>
+                    <a:xfrm>
+                      <a:off x="0" y="0"/>
+                      <a:ext cx="5525271" cy="3734321"/>
+                    </a:xfrm>
+                    <a:prstGeom prst="rect">
+                      <a:avLst/>
+                    </a:prstGeom>
+                  </pic:spPr>
+                </pic:pic>
+              </a:graphicData>
+            </a:graphic>
+          </wp:inline>
+        </w:drawing>
+      </w:r>
+    </w:p>
+    <w:p>
+      <w:pPr>
+        <w:rPr>
+          <w:b/>
+          <w:bCs/>
+          <w:lang w:val="en-US"/>
+        </w:rPr>
+      </w:pPr>
+    </w:p>
+    <w:p>
+      <w:pPr>
+        <w:rPr>
+          <w:b/>
+          <w:bCs/>
+          <w:lang w:val="en-US"/>
+        </w:rPr>
+      </w:pPr>
+      <w:r>
+        <w:rPr>
+          <w:b/>
+          <w:bCs/>
+          <w:noProof/>
+          <w:lang w:val="en-US"/>
+        </w:rPr>
+        <w:lastRenderedPageBreak/>
+        <w:drawing>
+          <wp:inline distT="0" distB="0" distL="0" distR="0" wp14:anchorId="42DF45B5" wp14:editId="5B4E13D3">
+            <wp:extent cx="5731510" cy="950595"/>
+            <wp:effectExtent l="0" t="0" r="2540" b="1905"/>
+            <wp:docPr id="1662524635" name="Picture 1"/>
+            <wp:cNvGraphicFramePr>
+              <a:graphicFrameLocks xmlns:a="http://schemas.openxmlformats.org/drawingml/2006/main" noChangeAspect="1"/>
+            </wp:cNvGraphicFramePr>
+            <a:graphic xmlns:a="http://schemas.openxmlformats.org/drawingml/2006/main">
+              <a:graphicData uri="http://schemas.openxmlformats.org/drawingml/2006/picture">
+                <pic:pic xmlns:pic="http://schemas.openxmlformats.org/drawingml/2006/picture">
+                  <pic:nvPicPr>
+                    <pic:cNvPr id="1662524635" name=""/>
+                    <pic:cNvPicPr/>
+                  </pic:nvPicPr>
+                  <pic:blipFill>
+                    <a:blip r:embed="rId50"/>
+                    <a:stretch>
+                      <a:fillRect/>
+                    </a:stretch>
+                  </pic:blipFill>
+                  <pic:spPr>
+                    <a:xfrm>
+                      <a:off x="0" y="0"/>
+                      <a:ext cx="5731510" cy="950595"/>
+                    </a:xfrm>
+                    <a:prstGeom prst="rect">
+                      <a:avLst/>
+                    </a:prstGeom>
+                  </pic:spPr>
+                </pic:pic>
+              </a:graphicData>
+            </a:graphic>
+          </wp:inline>
+        </w:drawing>
+      </w:r>
+    </w:p>
+    <w:p>
+      <w:pPr>
+        <w:rPr>
+          <w:b/>
+          <w:bCs/>
+          <w:lang w:val="en-US"/>
+        </w:rPr>
+      </w:pPr>
+    </w:p>
+    <w:p>
+      <w:pPr>
+        <w:rPr>
+          <w:b/>
+          <w:bCs/>
+          <w:lang w:val="en-US"/>
+        </w:rPr>
+      </w:pPr>
+    </w:p>
+    <w:p>
+      <w:pPr>
+        <w:rPr>
+          <w:b/>
+          <w:bCs/>
+          <w:lang w:val="en-US"/>
+        </w:rPr>
+      </w:pPr>
+    </w:p>
+    <w:p>
+      <w:pPr>
+        <w:rPr>
+          <w:b/>
+          <w:bCs/>
+          <w:lang w:val="en-US"/>
+        </w:rPr>
+      </w:pPr>
+    </w:p>
+    <w:p>
+      <w:pPr>
+        <w:rPr>
+          <w:b/>
+          <w:bCs/>
+          <w:lang w:val="en-US"/>
+        </w:rPr>
+      </w:pPr>
+    </w:p>
+    <w:p>
+      <w:pPr>
+        <w:rPr>
+          <w:b/>
+          <w:bCs/>
+          <w:lang w:val="en-US"/>
+        </w:rPr>
+      </w:pPr>
+    </w:p>
+    <w:p>
+      <w:pPr>
+        <w:rPr>
+          <w:b/>
+          <w:bCs/>
+          <w:lang w:val="en-US"/>
+        </w:rPr>
+      </w:pPr>
+    </w:p>
+    <w:p>
+      <w:pPr>
+        <w:rPr>
+          <w:lang w:val="en-US"/>
+        </w:rPr>
+      </w:pPr>
+    </w:p>
+    <w:p>
+      <w:pPr>
+        <w:rPr>
+          <w:lang w:val="en-US"/>
+        </w:rPr>
+      </w:pPr>
     </w:p>
     <w:sectPr>
       <w:pgSz w:w="11906" w:h="16838"/>

</xml_diff>

<commit_message>
news summarizer using tool
</commit_message>
<xml_diff>
--- a/GenAI by Sheryians Notes.docx
+++ b/GenAI by Sheryians Notes.docx
@@ -40,21 +40,7 @@
         <w:rPr>
           <w:lang w:val="en-US"/>
         </w:rPr>
-        <w:t xml:space="preserve">Use </w:t>
-      </w:r>
-      <w:proofErr w:type="spellStart"/>
-      <w:r>
-        <w:rPr>
-          <w:lang w:val="en-US"/>
-        </w:rPr>
-        <w:t>uv</w:t>
-      </w:r>
-      <w:proofErr w:type="spellEnd"/>
-      <w:r>
-        <w:rPr>
-          <w:lang w:val="en-US"/>
-        </w:rPr>
-        <w:t>:</w:t>
+        <w:t>Use uv:</w:t>
       </w:r>
       <w:r>
         <w:rPr>
@@ -75,31 +61,7 @@
         </w:numPr>
       </w:pPr>
       <w:r>
-        <w:t>A single tool to replace pip, pip-tools, </w:t>
-      </w:r>
-      <w:proofErr w:type="spellStart"/>
-      <w:r>
-        <w:t>pipx</w:t>
-      </w:r>
-      <w:proofErr w:type="spellEnd"/>
-      <w:r>
-        <w:t>, poetry, </w:t>
-      </w:r>
-      <w:proofErr w:type="spellStart"/>
-      <w:r>
-        <w:t>pyenv</w:t>
-      </w:r>
-      <w:proofErr w:type="spellEnd"/>
-      <w:r>
-        <w:t>, twine, </w:t>
-      </w:r>
-      <w:proofErr w:type="spellStart"/>
-      <w:r>
-        <w:t>virtualenv</w:t>
-      </w:r>
-      <w:proofErr w:type="spellEnd"/>
-      <w:r>
-        <w:t>, and more.</w:t>
+        <w:t>A single tool to replace pip, pip-tools, pipx, poetry, pyenv, twine, virtualenv, and more.</w:t>
       </w:r>
     </w:p>
     <w:p>
@@ -147,18 +109,155 @@
           <w:rPr>
             <w:rStyle w:val="Hyperlink"/>
           </w:rPr>
-          <w:t xml:space="preserve">universal </w:t>
+          <w:t>universal lockfile</w:t>
         </w:r>
-        <w:proofErr w:type="spellStart"/>
+      </w:hyperlink>
+      <w:r>
+        <w:t>.</w:t>
+      </w:r>
+    </w:p>
+    <w:p>
+      <w:pPr>
+        <w:rPr>
+          <w:lang w:val="en-US"/>
+        </w:rPr>
+      </w:pPr>
+      <w:r>
+        <w:rPr>
+          <w:lang w:val="en-US"/>
+        </w:rPr>
+        <w:t xml:space="preserve">Define API key in separate file </w:t>
+      </w:r>
+      <w:r>
+        <w:rPr>
+          <w:lang w:val="en-US"/>
+        </w:rPr>
+        <w:t>usually in .env file</w:t>
+      </w:r>
+    </w:p>
+    <w:p>
+      <w:pPr>
+        <w:rPr>
+          <w:lang w:val="en-US"/>
+        </w:rPr>
+      </w:pPr>
+      <w:r>
+        <w:rPr>
+          <w:lang w:val="en-US"/>
+        </w:rPr>
+        <w:t>G</w:t>
+      </w:r>
+      <w:r>
+        <w:rPr>
+          <w:lang w:val="en-US"/>
+        </w:rPr>
+        <w:t>ro</w:t>
+      </w:r>
+      <w:r>
+        <w:rPr>
+          <w:lang w:val="en-US"/>
+        </w:rPr>
+        <w:t>q can be used for free API Keys for many LLMs</w:t>
+      </w:r>
+      <w:r>
+        <w:rPr>
+          <w:lang w:val="en-US"/>
+        </w:rPr>
+        <w:t>.</w:t>
+      </w:r>
+    </w:p>
+    <w:p>
+      <w:pPr>
+        <w:rPr>
+          <w:lang w:val="en-US"/>
+        </w:rPr>
+      </w:pPr>
+    </w:p>
+    <w:p>
+      <w:pPr>
+        <w:rPr>
+          <w:lang w:val="en-US"/>
+        </w:rPr>
+      </w:pPr>
+      <w:r>
+        <w:rPr>
+          <w:lang w:val="en-US"/>
+        </w:rPr>
+        <w:t>Using Python , more token are burnt in using Gemini as compared to Java script</w:t>
+      </w:r>
+      <w:r>
+        <w:rPr>
+          <w:lang w:val="en-US"/>
+        </w:rPr>
+        <w:t>.</w:t>
+      </w:r>
+    </w:p>
+    <w:p>
+      <w:pPr>
+        <w:rPr>
+          <w:lang w:val="en-US"/>
+        </w:rPr>
+      </w:pPr>
+    </w:p>
+    <w:p>
+      <w:r>
+        <w:rPr>
+          <w:lang w:val="en-US"/>
+        </w:rPr>
+        <w:t xml:space="preserve">Use </w:t>
+      </w:r>
+      <w:r>
+        <w:rPr>
+          <w:b/>
+          <w:bCs/>
+        </w:rPr>
+        <w:t>python-dotenv</w:t>
+      </w:r>
+      <w:r>
+        <w:t xml:space="preserve"> library</w:t>
+      </w:r>
+      <w:r>
+        <w:t xml:space="preserve"> </w:t>
+      </w:r>
+      <w:r>
+        <w:t>for managing "secrets" like API keys, database passwords, and configuration settings.</w:t>
+      </w:r>
+      <w:r>
+        <w:t>it reads key-value pairs from a .env file and adds them to your system's environment variables.</w:t>
+      </w:r>
+    </w:p>
+    <w:p>
+      <w:pPr>
+        <w:rPr>
+          <w:b/>
+          <w:bCs/>
+        </w:rPr>
+      </w:pPr>
+      <w:r>
+        <w:rPr>
+          <w:b/>
+          <w:bCs/>
+        </w:rPr>
+        <w:br/>
+        <w:t>Initialize a model</w:t>
+      </w:r>
+    </w:p>
+    <w:p>
+      <w:r>
+        <w:t>The easiest way to get started with a standalone model in LangChain is to use </w:t>
+      </w:r>
+      <w:hyperlink r:id="rId8" w:tgtFrame="_blank" w:history="1">
         <w:r>
           <w:rPr>
             <w:rStyle w:val="Hyperlink"/>
           </w:rPr>
-          <w:t>lockfile</w:t>
+          <w:t>init_chat_model</w:t>
         </w:r>
-        <w:proofErr w:type="spellEnd"/>
       </w:hyperlink>
       <w:r>
+        <w:t> to initialize one from a chat model provider of your choice</w:t>
+      </w:r>
+      <w:r>
         <w:t>.</w:t>
       </w:r>
     </w:p>
@@ -168,236 +267,16 @@
           <w:lang w:val="en-US"/>
         </w:rPr>
       </w:pPr>
-      <w:proofErr w:type="gramStart"/>
-      <w:r>
-        <w:rPr>
-          <w:lang w:val="en-US"/>
-        </w:rPr>
-        <w:t>Define</w:t>
-      </w:r>
-      <w:proofErr w:type="gramEnd"/>
-      <w:r>
-        <w:rPr>
-          <w:lang w:val="en-US"/>
-        </w:rPr>
-        <w:t xml:space="preserve"> API key in separate file </w:t>
-      </w:r>
-      <w:r>
-        <w:rPr>
-          <w:lang w:val="en-US"/>
-        </w:rPr>
-        <w:t>usually in .env file</w:t>
-      </w:r>
-    </w:p>
-    <w:p>
-      <w:pPr>
-        <w:rPr>
-          <w:lang w:val="en-US"/>
-        </w:rPr>
-      </w:pPr>
-      <w:proofErr w:type="spellStart"/>
-      <w:r>
-        <w:rPr>
-          <w:lang w:val="en-US"/>
-        </w:rPr>
-        <w:t>G</w:t>
-      </w:r>
-      <w:r>
-        <w:rPr>
-          <w:lang w:val="en-US"/>
-        </w:rPr>
-        <w:t>ro</w:t>
-      </w:r>
-      <w:r>
-        <w:rPr>
-          <w:lang w:val="en-US"/>
-        </w:rPr>
-        <w:t>q</w:t>
-      </w:r>
-      <w:proofErr w:type="spellEnd"/>
-      <w:r>
-        <w:rPr>
-          <w:lang w:val="en-US"/>
-        </w:rPr>
-        <w:t xml:space="preserve"> can be used for free API Keys for many LLMs</w:t>
-      </w:r>
-      <w:r>
-        <w:rPr>
-          <w:lang w:val="en-US"/>
-        </w:rPr>
-        <w:t>.</w:t>
-      </w:r>
-    </w:p>
-    <w:p>
-      <w:pPr>
-        <w:rPr>
-          <w:lang w:val="en-US"/>
-        </w:rPr>
-      </w:pPr>
-    </w:p>
-    <w:p>
-      <w:pPr>
-        <w:rPr>
-          <w:lang w:val="en-US"/>
-        </w:rPr>
-      </w:pPr>
-      <w:r>
-        <w:rPr>
-          <w:lang w:val="en-US"/>
-        </w:rPr>
+      <w:r>
         <w:t xml:space="preserve">Using </w:t>
       </w:r>
-      <w:proofErr w:type="gramStart"/>
-      <w:r>
-        <w:rPr>
-          <w:lang w:val="en-US"/>
-        </w:rPr>
-        <w:t>Python ,</w:t>
-      </w:r>
-      <w:proofErr w:type="gramEnd"/>
-      <w:r>
-        <w:rPr>
-          <w:lang w:val="en-US"/>
-        </w:rPr>
-        <w:t xml:space="preserve"> more </w:t>
-      </w:r>
-      <w:proofErr w:type="gramStart"/>
-      <w:r>
-        <w:rPr>
-          <w:lang w:val="en-US"/>
-        </w:rPr>
-        <w:t>token</w:t>
-      </w:r>
-      <w:proofErr w:type="gramEnd"/>
-      <w:r>
-        <w:rPr>
-          <w:lang w:val="en-US"/>
-        </w:rPr>
-        <w:t xml:space="preserve"> are burnt in using Gemini as compared to Java script</w:t>
-      </w:r>
-      <w:r>
-        <w:rPr>
-          <w:lang w:val="en-US"/>
-        </w:rPr>
-        <w:t>.</w:t>
-      </w:r>
-    </w:p>
-    <w:p>
-      <w:pPr>
-        <w:rPr>
-          <w:lang w:val="en-US"/>
-        </w:rPr>
-      </w:pPr>
-    </w:p>
-    <w:p>
-      <w:r>
-        <w:rPr>
-          <w:lang w:val="en-US"/>
-        </w:rPr>
-        <w:t xml:space="preserve">Use </w:t>
-      </w:r>
-      <w:r>
-        <w:rPr>
-          <w:b/>
-          <w:bCs/>
-        </w:rPr>
-        <w:t>python-</w:t>
-      </w:r>
-      <w:proofErr w:type="spellStart"/>
-      <w:r>
-        <w:rPr>
-          <w:b/>
-          <w:bCs/>
-        </w:rPr>
-        <w:t>dotenv</w:t>
-      </w:r>
-      <w:proofErr w:type="spellEnd"/>
-      <w:r>
-        <w:t xml:space="preserve"> library</w:t>
-      </w:r>
-      <w:r>
-        <w:t xml:space="preserve"> </w:t>
-      </w:r>
-      <w:r>
-        <w:t>for managing "secrets" like API keys, database passwords, and configuration settings.</w:t>
-      </w:r>
-      <w:r>
-        <w:t>it reads key-value pairs from a .env file and adds them to your system's environment variables.</w:t>
-      </w:r>
-    </w:p>
-    <w:p>
-      <w:pPr>
-        <w:rPr>
-          <w:b/>
-          <w:bCs/>
-        </w:rPr>
-      </w:pPr>
-      <w:r>
-        <w:rPr>
-          <w:b/>
-          <w:bCs/>
-        </w:rPr>
-        <w:br/>
-        <w:t>Initialize a model</w:t>
-      </w:r>
-    </w:p>
-    <w:p>
-      <w:r>
-        <w:t xml:space="preserve">The easiest way to get started with a standalone model in </w:t>
-      </w:r>
-      <w:proofErr w:type="spellStart"/>
-      <w:r>
-        <w:t>LangChain</w:t>
-      </w:r>
-      <w:proofErr w:type="spellEnd"/>
-      <w:r>
-        <w:t xml:space="preserve"> is to use </w:t>
-      </w:r>
-      <w:proofErr w:type="spellStart"/>
-      <w:r>
-        <w:fldChar w:fldCharType="begin"/>
-      </w:r>
-      <w:r>
-        <w:instrText>HYPERLINK "https://reference.langchain.com/python/langchain/chat_models/base/init_chat_model" \t "_blank"</w:instrText>
-      </w:r>
-      <w:r>
-        <w:fldChar w:fldCharType="separate"/>
-      </w:r>
-      <w:r>
-        <w:rPr>
-          <w:rStyle w:val="Hyperlink"/>
+      <w:r>
+        <w:rPr>
+          <w:b/>
+          <w:bCs/>
         </w:rPr>
         <w:t>init_chat_model</w:t>
       </w:r>
-      <w:proofErr w:type="spellEnd"/>
-      <w:r>
-        <w:fldChar w:fldCharType="end"/>
-      </w:r>
-      <w:r>
-        <w:t> to initialize one from a chat model provider of your choice</w:t>
-      </w:r>
-      <w:r>
-        <w:t>.</w:t>
-      </w:r>
-    </w:p>
-    <w:p>
-      <w:pPr>
-        <w:rPr>
-          <w:lang w:val="en-US"/>
-        </w:rPr>
-      </w:pPr>
-      <w:r>
-        <w:t xml:space="preserve">Using </w:t>
-      </w:r>
-      <w:proofErr w:type="spellStart"/>
-      <w:r>
-        <w:rPr>
-          <w:b/>
-          <w:bCs/>
-        </w:rPr>
-        <w:t>init_chat_model</w:t>
-      </w:r>
-      <w:proofErr w:type="spellEnd"/>
     </w:p>
     <w:p>
       <w:pPr>
@@ -426,7 +305,7 @@
                     <pic:cNvPicPr/>
                   </pic:nvPicPr>
                   <pic:blipFill>
-                    <a:blip r:embed="rId8"/>
+                    <a:blip r:embed="rId9"/>
                     <a:stretch>
                       <a:fillRect/>
                     </a:stretch>
@@ -492,7 +371,7 @@
                     <pic:cNvPicPr/>
                   </pic:nvPicPr>
                   <pic:blipFill>
-                    <a:blip r:embed="rId9"/>
+                    <a:blip r:embed="rId10"/>
                     <a:stretch>
                       <a:fillRect/>
                     </a:stretch>
@@ -532,19 +411,10 @@
         <w:t>Model Classes</w:t>
       </w:r>
       <w:r>
-        <w:t xml:space="preserve"> require provider-specific imports (e.g., </w:t>
-      </w:r>
-      <w:proofErr w:type="spellStart"/>
-      <w:r>
-        <w:t>ChatOpenAI</w:t>
-      </w:r>
-      <w:proofErr w:type="spellEnd"/>
-      <w:r>
-        <w:t>) and hardcode your application to a single LLM vendor.</w:t>
-      </w:r>
-    </w:p>
-    <w:p>
-      <w:proofErr w:type="spellStart"/>
+        <w:t xml:space="preserve"> require provider-specific imports (e.g., ChatOpenAI) and hardcode your application to a single LLM vendor.</w:t>
+      </w:r>
+    </w:p>
+    <w:p>
       <w:r>
         <w:rPr>
           <w:b/>
@@ -552,7 +422,6 @@
         </w:rPr>
         <w:t>init_chat_model</w:t>
       </w:r>
-      <w:proofErr w:type="spellEnd"/>
       <w:r>
         <w:t xml:space="preserve"> is a unified factory function that lets you dynamically swap providers (OpenAI, Anthropic, etc.) using simple string arguments without changing your imports or code structure.</w:t>
       </w:r>
@@ -566,15 +435,7 @@
         <w:t>Recommendation:</w:t>
       </w:r>
       <w:r>
-        <w:t xml:space="preserve"> Use </w:t>
-      </w:r>
-      <w:proofErr w:type="spellStart"/>
-      <w:r>
-        <w:t>init_chat_model</w:t>
-      </w:r>
-      <w:proofErr w:type="spellEnd"/>
-      <w:r>
-        <w:t xml:space="preserve"> by default to keep your code flexible, future-proof, and decoupled from specific vendors.</w:t>
+        <w:t xml:space="preserve"> Use init_chat_model by default to keep your code flexible, future-proof, and decoupled from specific vendors.</w:t>
       </w:r>
     </w:p>
     <w:p>
@@ -586,15 +447,7 @@
         <w:t>QUESTION</w:t>
       </w:r>
       <w:r>
-        <w:t xml:space="preserve">: How API keys are working without get </w:t>
-      </w:r>
-      <w:proofErr w:type="spellStart"/>
-      <w:r>
-        <w:t>os</w:t>
-      </w:r>
-      <w:proofErr w:type="spellEnd"/>
-      <w:r>
-        <w:t xml:space="preserve"> en</w:t>
+        <w:t>: How API keys are working without get os en</w:t>
       </w:r>
       <w:r>
         <w:t>v method</w:t>
@@ -683,7 +536,7 @@
                     <pic:cNvPicPr/>
                   </pic:nvPicPr>
                   <pic:blipFill>
-                    <a:blip r:embed="rId10"/>
+                    <a:blip r:embed="rId11"/>
                     <a:stretch>
                       <a:fillRect/>
                     </a:stretch>
@@ -748,23 +601,7 @@
           <w:b/>
           <w:bCs/>
         </w:rPr>
-        <w:t>1. Local Model (</w:t>
-      </w:r>
-      <w:proofErr w:type="spellStart"/>
-      <w:r>
-        <w:rPr>
-          <w:b/>
-          <w:bCs/>
-        </w:rPr>
-        <w:t>HuggingFaceEmbeddings</w:t>
-      </w:r>
-      <w:proofErr w:type="spellEnd"/>
-      <w:r>
-        <w:rPr>
-          <w:b/>
-          <w:bCs/>
-        </w:rPr>
-        <w:t>)</w:t>
+        <w:t>1. Local Model (HuggingFaceEmbeddings)</w:t>
       </w:r>
     </w:p>
     <w:p>
@@ -800,15 +637,7 @@
         <w:t>Execution:</w:t>
       </w:r>
       <w:r>
-        <w:t xml:space="preserve"> When you run </w:t>
-      </w:r>
-      <w:proofErr w:type="spellStart"/>
-      <w:r>
-        <w:t>embeddings.embed_query</w:t>
-      </w:r>
-      <w:proofErr w:type="spellEnd"/>
-      <w:r>
-        <w:t xml:space="preserve">(), your own computer's </w:t>
+        <w:t xml:space="preserve"> When you run embeddings.embed_query(), your own computer's </w:t>
       </w:r>
       <w:r>
         <w:rPr>
@@ -833,23 +662,7 @@
           <w:b/>
           <w:bCs/>
         </w:rPr>
-        <w:t>2. API Endpoint (</w:t>
-      </w:r>
-      <w:proofErr w:type="spellStart"/>
-      <w:r>
-        <w:rPr>
-          <w:b/>
-          <w:bCs/>
-        </w:rPr>
-        <w:t>HuggingFaceEndpointEmbeddings</w:t>
-      </w:r>
-      <w:proofErr w:type="spellEnd"/>
-      <w:r>
-        <w:rPr>
-          <w:b/>
-          <w:bCs/>
-        </w:rPr>
-        <w:t>)</w:t>
+        <w:t>2. API Endpoint (HuggingFaceEndpointEmbeddings)</w:t>
       </w:r>
     </w:p>
     <w:p>
@@ -885,23 +698,7 @@
         <w:t>Execution:</w:t>
       </w:r>
       <w:r>
-        <w:t xml:space="preserve"> When you run </w:t>
-      </w:r>
-      <w:proofErr w:type="spellStart"/>
-      <w:r>
-        <w:t>embeddings.embed_query</w:t>
-      </w:r>
-      <w:proofErr w:type="spellEnd"/>
-      <w:r>
-        <w:t xml:space="preserve">(), </w:t>
-      </w:r>
-      <w:proofErr w:type="spellStart"/>
-      <w:r>
-        <w:t>LangChain</w:t>
-      </w:r>
-      <w:proofErr w:type="spellEnd"/>
-      <w:r>
-        <w:t xml:space="preserve"> sends your text across the internet via an HTTP request to Hugging Face. Their cloud servers compute the vectors and send the numbers back to your script.</w:t>
+        <w:t xml:space="preserve"> When you run embeddings.embed_query(), LangChain sends your text across the internet via an HTTP request to Hugging Face. Their cloud servers compute the vectors and send the numbers back to your script.</w:t>
       </w:r>
     </w:p>
     <w:p>
@@ -911,13 +708,8 @@
     </w:p>
     <w:p>
       <w:r>
-        <w:t xml:space="preserve">Problem in saving chat history in simple </w:t>
-      </w:r>
-      <w:proofErr w:type="spellStart"/>
-      <w:r>
-        <w:t>dictionory</w:t>
-      </w:r>
-      <w:proofErr w:type="spellEnd"/>
+        <w:t>Problem in saving chat history in simple dictionory</w:t>
+      </w:r>
     </w:p>
     <w:p>
       <w:r>
@@ -940,7 +732,7 @@
                     <pic:cNvPicPr/>
                   </pic:nvPicPr>
                   <pic:blipFill>
-                    <a:blip r:embed="rId11"/>
+                    <a:blip r:embed="rId12"/>
                     <a:stretch>
                       <a:fillRect/>
                     </a:stretch>
@@ -984,7 +776,7 @@
                     <pic:cNvPicPr/>
                   </pic:nvPicPr>
                   <pic:blipFill>
-                    <a:blip r:embed="rId12"/>
+                    <a:blip r:embed="rId13"/>
                     <a:stretch>
                       <a:fillRect/>
                     </a:stretch>
@@ -1027,7 +819,7 @@
                     <pic:cNvPicPr/>
                   </pic:nvPicPr>
                   <pic:blipFill>
-                    <a:blip r:embed="rId13"/>
+                    <a:blip r:embed="rId14"/>
                     <a:stretch>
                       <a:fillRect/>
                     </a:stretch>
@@ -1070,7 +862,7 @@
                     <pic:cNvPicPr/>
                   </pic:nvPicPr>
                   <pic:blipFill>
-                    <a:blip r:embed="rId14"/>
+                    <a:blip r:embed="rId15"/>
                     <a:stretch>
                       <a:fillRect/>
                     </a:stretch>
@@ -1118,7 +910,7 @@
                     <pic:cNvPicPr/>
                   </pic:nvPicPr>
                   <pic:blipFill>
-                    <a:blip r:embed="rId15"/>
+                    <a:blip r:embed="rId16"/>
                     <a:stretch>
                       <a:fillRect/>
                     </a:stretch>
@@ -1161,7 +953,7 @@
                     <pic:cNvPicPr/>
                   </pic:nvPicPr>
                   <pic:blipFill>
-                    <a:blip r:embed="rId16"/>
+                    <a:blip r:embed="rId17"/>
                     <a:stretch>
                       <a:fillRect/>
                     </a:stretch>
@@ -1204,7 +996,7 @@
                     <pic:cNvPicPr/>
                   </pic:nvPicPr>
                   <pic:blipFill>
-                    <a:blip r:embed="rId17"/>
+                    <a:blip r:embed="rId18"/>
                     <a:stretch>
                       <a:fillRect/>
                     </a:stretch>
@@ -1247,7 +1039,7 @@
                     <pic:cNvPicPr/>
                   </pic:nvPicPr>
                   <pic:blipFill>
-                    <a:blip r:embed="rId18"/>
+                    <a:blip r:embed="rId19"/>
                     <a:stretch>
                       <a:fillRect/>
                     </a:stretch>
@@ -1290,7 +1082,7 @@
                     <pic:cNvPicPr/>
                   </pic:nvPicPr>
                   <pic:blipFill>
-                    <a:blip r:embed="rId19"/>
+                    <a:blip r:embed="rId20"/>
                     <a:stretch>
                       <a:fillRect/>
                     </a:stretch>
@@ -1332,7 +1124,7 @@
                     <pic:cNvPicPr/>
                   </pic:nvPicPr>
                   <pic:blipFill>
-                    <a:blip r:embed="rId20"/>
+                    <a:blip r:embed="rId21"/>
                     <a:stretch>
                       <a:fillRect/>
                     </a:stretch>
@@ -1375,7 +1167,7 @@
                     <pic:cNvPicPr/>
                   </pic:nvPicPr>
                   <pic:blipFill>
-                    <a:blip r:embed="rId21"/>
+                    <a:blip r:embed="rId22"/>
                     <a:stretch>
                       <a:fillRect/>
                     </a:stretch>
@@ -1417,7 +1209,7 @@
                     <pic:cNvPicPr/>
                   </pic:nvPicPr>
                   <pic:blipFill>
-                    <a:blip r:embed="rId22"/>
+                    <a:blip r:embed="rId23"/>
                     <a:stretch>
                       <a:fillRect/>
                     </a:stretch>
@@ -1460,7 +1252,7 @@
                     <pic:cNvPicPr/>
                   </pic:nvPicPr>
                   <pic:blipFill>
-                    <a:blip r:embed="rId23"/>
+                    <a:blip r:embed="rId24"/>
                     <a:stretch>
                       <a:fillRect/>
                     </a:stretch>
@@ -1503,7 +1295,7 @@
                     <pic:cNvPicPr/>
                   </pic:nvPicPr>
                   <pic:blipFill>
-                    <a:blip r:embed="rId24"/>
+                    <a:blip r:embed="rId25"/>
                     <a:stretch>
                       <a:fillRect/>
                     </a:stretch>
@@ -1546,7 +1338,7 @@
                     <pic:cNvPicPr/>
                   </pic:nvPicPr>
                   <pic:blipFill>
-                    <a:blip r:embed="rId25"/>
+                    <a:blip r:embed="rId26"/>
                     <a:stretch>
                       <a:fillRect/>
                     </a:stretch>
@@ -1589,7 +1381,7 @@
                     <pic:cNvPicPr/>
                   </pic:nvPicPr>
                   <pic:blipFill>
-                    <a:blip r:embed="rId26"/>
+                    <a:blip r:embed="rId27"/>
                     <a:stretch>
                       <a:fillRect/>
                     </a:stretch>
@@ -1632,7 +1424,7 @@
                     <pic:cNvPicPr/>
                   </pic:nvPicPr>
                   <pic:blipFill>
-                    <a:blip r:embed="rId27"/>
+                    <a:blip r:embed="rId28"/>
                     <a:stretch>
                       <a:fillRect/>
                     </a:stretch>
@@ -1675,7 +1467,7 @@
                     <pic:cNvPicPr/>
                   </pic:nvPicPr>
                   <pic:blipFill>
-                    <a:blip r:embed="rId28"/>
+                    <a:blip r:embed="rId29"/>
                     <a:stretch>
                       <a:fillRect/>
                     </a:stretch>
@@ -1717,7 +1509,7 @@
                     <pic:cNvPicPr/>
                   </pic:nvPicPr>
                   <pic:blipFill>
-                    <a:blip r:embed="rId29"/>
+                    <a:blip r:embed="rId30"/>
                     <a:stretch>
                       <a:fillRect/>
                     </a:stretch>
@@ -1761,7 +1553,7 @@
                     <pic:cNvPicPr/>
                   </pic:nvPicPr>
                   <pic:blipFill>
-                    <a:blip r:embed="rId30"/>
+                    <a:blip r:embed="rId31"/>
                     <a:stretch>
                       <a:fillRect/>
                     </a:stretch>
@@ -1811,7 +1603,7 @@
                     <pic:cNvPicPr/>
                   </pic:nvPicPr>
                   <pic:blipFill>
-                    <a:blip r:embed="rId31"/>
+                    <a:blip r:embed="rId32"/>
                     <a:stretch>
                       <a:fillRect/>
                     </a:stretch>
@@ -1854,7 +1646,7 @@
                     <pic:cNvPicPr/>
                   </pic:nvPicPr>
                   <pic:blipFill>
-                    <a:blip r:embed="rId32"/>
+                    <a:blip r:embed="rId33"/>
                     <a:stretch>
                       <a:fillRect/>
                     </a:stretch>
@@ -1897,7 +1689,7 @@
                     <pic:cNvPicPr/>
                   </pic:nvPicPr>
                   <pic:blipFill>
-                    <a:blip r:embed="rId33"/>
+                    <a:blip r:embed="rId34"/>
                     <a:stretch>
                       <a:fillRect/>
                     </a:stretch>
@@ -1940,7 +1732,7 @@
                     <pic:cNvPicPr/>
                   </pic:nvPicPr>
                   <pic:blipFill>
-                    <a:blip r:embed="rId34"/>
+                    <a:blip r:embed="rId35"/>
                     <a:stretch>
                       <a:fillRect/>
                     </a:stretch>
@@ -1984,7 +1776,7 @@
                     <pic:cNvPicPr/>
                   </pic:nvPicPr>
                   <pic:blipFill>
-                    <a:blip r:embed="rId35"/>
+                    <a:blip r:embed="rId36"/>
                     <a:stretch>
                       <a:fillRect/>
                     </a:stretch>
@@ -2026,7 +1818,7 @@
                     <pic:cNvPicPr/>
                   </pic:nvPicPr>
                   <pic:blipFill>
-                    <a:blip r:embed="rId36"/>
+                    <a:blip r:embed="rId37"/>
                     <a:stretch>
                       <a:fillRect/>
                     </a:stretch>
@@ -2074,7 +1866,7 @@
                     <pic:cNvPicPr/>
                   </pic:nvPicPr>
                   <pic:blipFill>
-                    <a:blip r:embed="rId37"/>
+                    <a:blip r:embed="rId38"/>
                     <a:stretch>
                       <a:fillRect/>
                     </a:stretch>
@@ -2127,7 +1919,7 @@
                     <pic:cNvPicPr/>
                   </pic:nvPicPr>
                   <pic:blipFill>
-                    <a:blip r:embed="rId38"/>
+                    <a:blip r:embed="rId39"/>
                     <a:stretch>
                       <a:fillRect/>
                     </a:stretch>
@@ -2185,7 +1977,7 @@
                     <pic:cNvPicPr/>
                   </pic:nvPicPr>
                   <pic:blipFill>
-                    <a:blip r:embed="rId39"/>
+                    <a:blip r:embed="rId40"/>
                     <a:stretch>
                       <a:fillRect/>
                     </a:stretch>
@@ -2238,7 +2030,7 @@
                     <pic:cNvPicPr/>
                   </pic:nvPicPr>
                   <pic:blipFill>
-                    <a:blip r:embed="rId40"/>
+                    <a:blip r:embed="rId41"/>
                     <a:stretch>
                       <a:fillRect/>
                     </a:stretch>
@@ -2278,15 +2070,7 @@
         <w:t xml:space="preserve">: </w:t>
       </w:r>
       <w:r>
-        <w:t>(</w:t>
-      </w:r>
-      <w:proofErr w:type="spellStart"/>
-      <w:r>
-        <w:t>langchain_community</w:t>
-      </w:r>
-      <w:proofErr w:type="spellEnd"/>
-      <w:r>
-        <w:t>)</w:t>
+        <w:t>(langchain_community)</w:t>
       </w:r>
     </w:p>
     <w:p>
@@ -2310,53 +2094,12 @@
           <w:bCs/>
         </w:rPr>
       </w:pPr>
-      <w:proofErr w:type="spellStart"/>
-      <w:r>
-        <w:rPr>
-          <w:b/>
-          <w:bCs/>
-        </w:rPr>
-        <w:t>LangChain</w:t>
-      </w:r>
-      <w:proofErr w:type="spellEnd"/>
-      <w:r>
-        <w:rPr>
-          <w:b/>
-          <w:bCs/>
-        </w:rPr>
-        <w:t xml:space="preserve"> </w:t>
-      </w:r>
-      <w:proofErr w:type="spellStart"/>
-      <w:r>
-        <w:rPr>
-          <w:b/>
-          <w:bCs/>
-        </w:rPr>
-        <w:t>Docling</w:t>
-      </w:r>
-      <w:proofErr w:type="spellEnd"/>
-      <w:r>
-        <w:rPr>
-          <w:b/>
-          <w:bCs/>
-        </w:rPr>
-        <w:t xml:space="preserve"> Loader (</w:t>
-      </w:r>
-      <w:proofErr w:type="spellStart"/>
-      <w:r>
-        <w:rPr>
-          <w:b/>
-          <w:bCs/>
-        </w:rPr>
-        <w:t>DoclingLoader</w:t>
-      </w:r>
-      <w:proofErr w:type="spellEnd"/>
-      <w:r>
-        <w:rPr>
-          <w:b/>
-          <w:bCs/>
-        </w:rPr>
-        <w:t>)</w:t>
+      <w:r>
+        <w:rPr>
+          <w:b/>
+          <w:bCs/>
+        </w:rPr>
+        <w:t>LangChain Docling Loader (DoclingLoader)</w:t>
       </w:r>
     </w:p>
     <w:p>
@@ -2419,7 +2162,7 @@
                     <pic:cNvPicPr/>
                   </pic:nvPicPr>
                   <pic:blipFill>
-                    <a:blip r:embed="rId41"/>
+                    <a:blip r:embed="rId42"/>
                     <a:stretch>
                       <a:fillRect/>
                     </a:stretch>
@@ -2500,7 +2243,7 @@
                     <pic:cNvPicPr/>
                   </pic:nvPicPr>
                   <pic:blipFill>
-                    <a:blip r:embed="rId42"/>
+                    <a:blip r:embed="rId43"/>
                     <a:stretch>
                       <a:fillRect/>
                     </a:stretch>
@@ -2558,7 +2301,7 @@
                     <pic:cNvPicPr/>
                   </pic:nvPicPr>
                   <pic:blipFill>
-                    <a:blip r:embed="rId43"/>
+                    <a:blip r:embed="rId44"/>
                     <a:stretch>
                       <a:fillRect/>
                     </a:stretch>
@@ -2664,7 +2407,7 @@
                     <pic:cNvPicPr/>
                   </pic:nvPicPr>
                   <pic:blipFill>
-                    <a:blip r:embed="rId44"/>
+                    <a:blip r:embed="rId45"/>
                     <a:stretch>
                       <a:fillRect/>
                     </a:stretch>
@@ -2713,7 +2456,7 @@
                     <pic:cNvPicPr/>
                   </pic:nvPicPr>
                   <pic:blipFill>
-                    <a:blip r:embed="rId45"/>
+                    <a:blip r:embed="rId46"/>
                     <a:stretch>
                       <a:fillRect/>
                     </a:stretch>
@@ -2736,52 +2479,20 @@
     </w:p>
     <w:p>
       <w:r>
-        <w:t xml:space="preserve">When we upload the text in docs, it </w:t>
-      </w:r>
-      <w:proofErr w:type="gramStart"/>
-      <w:r>
-        <w:t>generate</w:t>
-      </w:r>
-      <w:proofErr w:type="gramEnd"/>
-      <w:r>
-        <w:t xml:space="preserve"> the list of 1 item </w:t>
-      </w:r>
-      <w:r>
-        <w:rPr>
-          <w:b/>
-          <w:bCs/>
-        </w:rPr>
-        <w:t xml:space="preserve">but when we upload the PDF Document, it </w:t>
-      </w:r>
-      <w:proofErr w:type="gramStart"/>
-      <w:r>
-        <w:rPr>
-          <w:b/>
-          <w:bCs/>
-        </w:rPr>
-        <w:t>generate</w:t>
-      </w:r>
-      <w:proofErr w:type="gramEnd"/>
-      <w:r>
-        <w:rPr>
-          <w:b/>
-          <w:bCs/>
-        </w:rPr>
-        <w:t xml:space="preserve"> the list of more than 1 items,</w:t>
-      </w:r>
-      <w:r>
-        <w:t xml:space="preserve"> 15 in below </w:t>
-      </w:r>
-      <w:proofErr w:type="gramStart"/>
-      <w:r>
-        <w:t>example</w:t>
-      </w:r>
-      <w:r>
-        <w:t>(</w:t>
-      </w:r>
-      <w:proofErr w:type="gramEnd"/>
-      <w:r>
-        <w:t>same as page numbers in pdf document).</w:t>
+        <w:t xml:space="preserve">When we upload the text in docs, it generate the list of 1 item </w:t>
+      </w:r>
+      <w:r>
+        <w:rPr>
+          <w:b/>
+          <w:bCs/>
+        </w:rPr>
+        <w:t>but when we upload the PDF Document, it generate the list of more than 1 items,</w:t>
+      </w:r>
+      <w:r>
+        <w:t xml:space="preserve"> 15 in below example</w:t>
+      </w:r>
+      <w:r>
+        <w:t>(same as page numbers in pdf document).</w:t>
       </w:r>
     </w:p>
     <w:p/>
@@ -2806,7 +2517,7 @@
                     <pic:cNvPicPr/>
                   </pic:nvPicPr>
                   <pic:blipFill>
-                    <a:blip r:embed="rId46"/>
+                    <a:blip r:embed="rId47"/>
                     <a:stretch>
                       <a:fillRect/>
                     </a:stretch>
@@ -2842,32 +2553,22 @@
           <w:lang w:val="en-US"/>
         </w:rPr>
       </w:pPr>
-      <w:proofErr w:type="spellStart"/>
-      <w:r>
-        <w:rPr>
-          <w:b/>
-          <w:bCs/>
-          <w:lang w:val="en-US"/>
-        </w:rPr>
-        <w:t>Langchain</w:t>
-      </w:r>
-      <w:proofErr w:type="spellEnd"/>
-      <w:r>
-        <w:rPr>
-          <w:b/>
-          <w:bCs/>
-          <w:lang w:val="en-US"/>
-        </w:rPr>
-        <w:t xml:space="preserve"> Community Sunset</w:t>
-      </w:r>
-    </w:p>
-    <w:p>
-      <w:pPr>
-        <w:rPr>
-          <w:lang w:val="en-US"/>
-        </w:rPr>
-      </w:pPr>
-      <w:hyperlink r:id="rId47" w:history="1">
+      <w:r>
+        <w:rPr>
+          <w:b/>
+          <w:bCs/>
+          <w:lang w:val="en-US"/>
+        </w:rPr>
+        <w:t>Langchain Community Sunset</w:t>
+      </w:r>
+    </w:p>
+    <w:p>
+      <w:pPr>
+        <w:rPr>
+          <w:lang w:val="en-US"/>
+        </w:rPr>
+      </w:pPr>
+      <w:hyperlink r:id="rId48" w:history="1">
         <w:r>
           <w:rPr>
             <w:rStyle w:val="Hyperlink"/>
@@ -2990,7 +2691,7 @@
                     <pic:cNvPicPr/>
                   </pic:nvPicPr>
                   <pic:blipFill>
-                    <a:blip r:embed="rId48"/>
+                    <a:blip r:embed="rId49"/>
                     <a:stretch>
                       <a:fillRect/>
                     </a:stretch>
@@ -3086,7 +2787,7 @@
                     <pic:cNvPicPr/>
                   </pic:nvPicPr>
                   <pic:blipFill>
-                    <a:blip r:embed="rId49"/>
+                    <a:blip r:embed="rId50"/>
                     <a:stretch>
                       <a:fillRect/>
                     </a:stretch>
@@ -3148,7 +2849,7 @@
                     <pic:cNvPicPr/>
                   </pic:nvPicPr>
                   <pic:blipFill>
-                    <a:blip r:embed="rId50"/>
+                    <a:blip r:embed="rId51"/>
                     <a:stretch>
                       <a:fillRect/>
                     </a:stretch>
@@ -3190,15 +2891,7 @@
         <w:t>The character or string used to split the text (defaults to "\n\n")</w:t>
       </w:r>
       <w:r>
-        <w:t xml:space="preserve"> in </w:t>
-      </w:r>
-      <w:proofErr w:type="spellStart"/>
-      <w:r>
-        <w:t>Langchain</w:t>
-      </w:r>
-      <w:proofErr w:type="spellEnd"/>
-      <w:r>
-        <w:t>.</w:t>
+        <w:t xml:space="preserve"> in Langchain.</w:t>
       </w:r>
       <w:r>
         <w:t xml:space="preserve"> It can be changed</w:t>
@@ -3208,21 +2901,12 @@
       </w:r>
     </w:p>
     <w:p>
-      <w:proofErr w:type="spellStart"/>
-      <w:r>
-        <w:rPr>
-          <w:b/>
-          <w:bCs/>
-        </w:rPr>
-        <w:t>chunk_size</w:t>
-      </w:r>
-      <w:proofErr w:type="spellEnd"/>
-      <w:r>
-        <w:rPr>
-          <w:b/>
-          <w:bCs/>
-        </w:rPr>
-        <w:t xml:space="preserve">: </w:t>
+      <w:r>
+        <w:rPr>
+          <w:b/>
+          <w:bCs/>
+        </w:rPr>
+        <w:t xml:space="preserve">chunk_size: </w:t>
       </w:r>
       <w:r>
         <w:t>The maximum number of characters allowed per chunk.</w:t>
@@ -3234,23 +2918,7 @@
           <w:b/>
           <w:bCs/>
         </w:rPr>
-        <w:t xml:space="preserve"> </w:t>
-      </w:r>
-      <w:proofErr w:type="spellStart"/>
-      <w:r>
-        <w:rPr>
-          <w:b/>
-          <w:bCs/>
-        </w:rPr>
-        <w:t>chunk_overlap</w:t>
-      </w:r>
-      <w:proofErr w:type="spellEnd"/>
-      <w:r>
-        <w:rPr>
-          <w:b/>
-          <w:bCs/>
-        </w:rPr>
-        <w:t xml:space="preserve">: </w:t>
+        <w:t xml:space="preserve"> chunk_overlap: </w:t>
       </w:r>
       <w:r>
         <w:t>The number of characters shared between consecutive chunks to preserve contextual continuity</w:t>
@@ -3277,7 +2945,7 @@
                     <pic:cNvPicPr/>
                   </pic:nvPicPr>
                   <pic:blipFill>
-                    <a:blip r:embed="rId51"/>
+                    <a:blip r:embed="rId52"/>
                     <a:stretch>
                       <a:fillRect/>
                     </a:stretch>
@@ -3320,7 +2988,7 @@
                     <pic:cNvPicPr/>
                   </pic:nvPicPr>
                   <pic:blipFill>
-                    <a:blip r:embed="rId52"/>
+                    <a:blip r:embed="rId53"/>
                     <a:stretch>
                       <a:fillRect/>
                     </a:stretch>
@@ -3365,7 +3033,7 @@
                     <pic:cNvPicPr/>
                   </pic:nvPicPr>
                   <pic:blipFill>
-                    <a:blip r:embed="rId53"/>
+                    <a:blip r:embed="rId54"/>
                     <a:stretch>
                       <a:fillRect/>
                     </a:stretch>
@@ -3408,7 +3076,7 @@
                     <pic:cNvPicPr/>
                   </pic:nvPicPr>
                   <pic:blipFill>
-                    <a:blip r:embed="rId54"/>
+                    <a:blip r:embed="rId55"/>
                     <a:stretch>
                       <a:fillRect/>
                     </a:stretch>
@@ -3451,7 +3119,7 @@
                     <pic:cNvPicPr/>
                   </pic:nvPicPr>
                   <pic:blipFill>
-                    <a:blip r:embed="rId55"/>
+                    <a:blip r:embed="rId56"/>
                     <a:stretch>
                       <a:fillRect/>
                     </a:stretch>
@@ -3479,13 +3147,8 @@
       </w:r>
     </w:p>
     <w:p>
-      <w:proofErr w:type="spellStart"/>
-      <w:r>
-        <w:t>ChromaDB</w:t>
-      </w:r>
-      <w:proofErr w:type="spellEnd"/>
-      <w:r>
-        <w:t xml:space="preserve"> – For Development and Testing</w:t>
+      <w:r>
+        <w:t>ChromaDB – For Development and Testing</w:t>
       </w:r>
     </w:p>
     <w:p>
@@ -3520,7 +3183,7 @@
                     <pic:cNvPicPr/>
                   </pic:nvPicPr>
                   <pic:blipFill>
-                    <a:blip r:embed="rId56"/>
+                    <a:blip r:embed="rId57"/>
                     <a:stretch>
                       <a:fillRect/>
                     </a:stretch>
@@ -3543,15 +3206,7 @@
     </w:p>
     <w:p>
       <w:r>
-        <w:t xml:space="preserve">Sqlite3 file </w:t>
-      </w:r>
-      <w:proofErr w:type="gramStart"/>
-      <w:r>
-        <w:t>contain</w:t>
-      </w:r>
-      <w:proofErr w:type="gramEnd"/>
-      <w:r>
-        <w:t xml:space="preserve"> the document metadata and bin file has embeddings</w:t>
+        <w:t>Sqlite3 file contain the document metadata and bin file has embeddings</w:t>
       </w:r>
       <w:r>
         <w:t>.</w:t>
@@ -3578,7 +3233,7 @@
                     <pic:cNvPicPr/>
                   </pic:nvPicPr>
                   <pic:blipFill>
-                    <a:blip r:embed="rId57"/>
+                    <a:blip r:embed="rId58"/>
                     <a:stretch>
                       <a:fillRect/>
                     </a:stretch>
@@ -3601,23 +3256,7 @@
     </w:p>
     <w:p>
       <w:r>
-        <w:t xml:space="preserve">Similarity </w:t>
-      </w:r>
-      <w:proofErr w:type="gramStart"/>
-      <w:r>
-        <w:t>search</w:t>
-      </w:r>
-      <w:proofErr w:type="gramEnd"/>
-      <w:r>
-        <w:t xml:space="preserve"> are not runnable while retrievers are </w:t>
-      </w:r>
-      <w:proofErr w:type="spellStart"/>
-      <w:r>
-        <w:t>runnables</w:t>
-      </w:r>
-      <w:proofErr w:type="spellEnd"/>
-      <w:r>
-        <w:t>.</w:t>
+        <w:t>Similarity search are not runnable while retrievers are runnables.</w:t>
       </w:r>
     </w:p>
     <w:p>
@@ -3641,7 +3280,7 @@
                     <pic:cNvPicPr/>
                   </pic:nvPicPr>
                   <pic:blipFill>
-                    <a:blip r:embed="rId58"/>
+                    <a:blip r:embed="rId59"/>
                     <a:stretch>
                       <a:fillRect/>
                     </a:stretch>
@@ -3688,7 +3327,7 @@
                     <pic:cNvPicPr/>
                   </pic:nvPicPr>
                   <pic:blipFill>
-                    <a:blip r:embed="rId59"/>
+                    <a:blip r:embed="rId60"/>
                     <a:stretch>
                       <a:fillRect/>
                     </a:stretch>
@@ -3714,15 +3353,7 @@
     <w:p>
       <w:r>
         <w:lastRenderedPageBreak/>
-        <w:t xml:space="preserve">MMR is not used in Vector </w:t>
-      </w:r>
-      <w:proofErr w:type="gramStart"/>
-      <w:r>
-        <w:t>DB,</w:t>
-      </w:r>
-      <w:proofErr w:type="gramEnd"/>
-      <w:r>
-        <w:t xml:space="preserve"> it is available in retriever only.</w:t>
+        <w:t>MMR is not used in Vector DB, it is available in retriever only.</w:t>
       </w:r>
     </w:p>
     <w:p>
@@ -3746,7 +3377,7 @@
                     <pic:cNvPicPr/>
                   </pic:nvPicPr>
                   <pic:blipFill>
-                    <a:blip r:embed="rId60"/>
+                    <a:blip r:embed="rId61"/>
                     <a:stretch>
                       <a:fillRect/>
                     </a:stretch>
@@ -3789,7 +3420,7 @@
                     <pic:cNvPicPr/>
                   </pic:nvPicPr>
                   <pic:blipFill>
-                    <a:blip r:embed="rId61"/>
+                    <a:blip r:embed="rId62"/>
                     <a:stretch>
                       <a:fillRect/>
                     </a:stretch>
@@ -3837,7 +3468,7 @@
                     <pic:cNvPicPr/>
                   </pic:nvPicPr>
                   <pic:blipFill>
-                    <a:blip r:embed="rId62"/>
+                    <a:blip r:embed="rId63"/>
                     <a:stretch>
                       <a:fillRect/>
                     </a:stretch>
@@ -3876,13 +3507,8 @@
     <w:p/>
     <w:p>
       <w:r>
-        <w:t xml:space="preserve">Two missed points: Chat History and </w:t>
-      </w:r>
-      <w:proofErr w:type="spellStart"/>
-      <w:r>
-        <w:t>Runnables</w:t>
-      </w:r>
-      <w:proofErr w:type="spellEnd"/>
+        <w:t>Two missed points: Chat History and Runnables</w:t>
+      </w:r>
     </w:p>
     <w:p/>
     <w:p/>
@@ -3914,7 +3540,7 @@
                     <pic:cNvPicPr/>
                   </pic:nvPicPr>
                   <pic:blipFill>
-                    <a:blip r:embed="rId63"/>
+                    <a:blip r:embed="rId64"/>
                     <a:stretch>
                       <a:fillRect/>
                     </a:stretch>
@@ -3958,10 +3584,126 @@
       </w:r>
     </w:p>
     <w:p/>
-    <w:p/>
-    <w:p/>
-    <w:p/>
-    <w:p/>
+    <w:p>
+      <w:pPr>
+        <w:rPr>
+          <w:b/>
+          <w:bCs/>
+        </w:rPr>
+      </w:pPr>
+      <w:r>
+        <w:rPr>
+          <w:b/>
+          <w:bCs/>
+        </w:rPr>
+        <w:t>Passthrough Runnable:</w:t>
+      </w:r>
+    </w:p>
+    <w:p>
+      <w:r>
+        <w:t xml:space="preserve">It </w:t>
+      </w:r>
+      <w:r>
+        <w:t>passes inputs through unchanged or adds computed keys to dictionary inputs</w:t>
+      </w:r>
+      <w:r>
+        <w:t>.</w:t>
+      </w:r>
+    </w:p>
+    <w:p>
+      <w:r>
+        <w:t>Returns the exact input value it receives when used on its own.</w:t>
+      </w:r>
+    </w:p>
+    <w:p/>
+    <w:p/>
+    <w:p/>
+    <w:p>
+      <w:pPr>
+        <w:rPr>
+          <w:b/>
+          <w:bCs/>
+        </w:rPr>
+      </w:pPr>
+      <w:r>
+        <w:rPr>
+          <w:b/>
+          <w:bCs/>
+        </w:rPr>
+        <w:lastRenderedPageBreak/>
+        <w:t>Tools</w:t>
+      </w:r>
+    </w:p>
+    <w:p>
+      <w:r>
+        <w:t>Tools extend what </w:t>
+      </w:r>
+      <w:hyperlink r:id="rId65" w:history="1">
+        <w:r>
+          <w:rPr>
+            <w:rStyle w:val="Hyperlink"/>
+          </w:rPr>
+          <w:t>agents</w:t>
+        </w:r>
+      </w:hyperlink>
+      <w:r>
+        <w:t> can do—letting them fetch real-time data, execute code, query external databases, and take actions in the world.</w:t>
+      </w:r>
+    </w:p>
+    <w:p>
+      <w:r>
+        <w:t>Under the hood, tools are callable functions with well-defined inputs and outputs that get passed to a </w:t>
+      </w:r>
+      <w:hyperlink r:id="rId66" w:history="1">
+        <w:r>
+          <w:rPr>
+            <w:rStyle w:val="Hyperlink"/>
+          </w:rPr>
+          <w:t>chat model</w:t>
+        </w:r>
+      </w:hyperlink>
+      <w:r>
+        <w:t>.</w:t>
+      </w:r>
+    </w:p>
+    <w:p>
+      <w:r>
+        <w:t>The model decides when to invoke a tool based on the conversation context, and what input arguments to provide.</w:t>
+      </w:r>
+    </w:p>
+    <w:p>
+      <w:pPr>
+        <w:rPr>
+          <w:b/>
+          <w:bCs/>
+        </w:rPr>
+      </w:pPr>
+      <w:r>
+        <w:rPr>
+          <w:b/>
+          <w:bCs/>
+        </w:rPr>
+        <w:t>Prebuilt tools</w:t>
+      </w:r>
+    </w:p>
+    <w:p>
+      <w:r>
+        <w:t>LangChain provides a large collection of prebuilt tools and toolkits for common tasks like web search, code interpretation, database access, and more. These ready-to-use tools can be directly integrated into your agents without writing custom code</w:t>
+      </w:r>
+      <w:r>
+        <w:t>.</w:t>
+      </w:r>
+    </w:p>
+    <w:p/>
+    <w:p/>
+    <w:p>
+      <w:r>
+        <w:t xml:space="preserve">tavily key for </w:t>
+      </w:r>
+      <w:r>
+        <w:t>API Key usage</w:t>
+      </w:r>
+    </w:p>
     <w:p/>
     <w:p/>
     <w:p/>
@@ -5220,6 +4962,7 @@
   <w:style w:type="character" w:default="1" w:styleId="DefaultParagraphFont">
     <w:name w:val="Default Paragraph Font"/>
     <w:uiPriority w:val="1"/>
+    <w:semiHidden/>
     <w:unhideWhenUsed/>
   </w:style>
   <w:style w:type="table" w:default="1" w:styleId="TableNormal">

</xml_diff>

<commit_message>
llm tool calling v1
</commit_message>
<xml_diff>
--- a/GenAI by Sheryians Notes.docx
+++ b/GenAI by Sheryians Notes.docx
@@ -1,6 +1,6 @@
 
 <file path=word/document.xml><?xml version="1.0" encoding="utf-8"?>
-<w:document xmlns:wpc="http://schemas.microsoft.com/office/word/2010/wordprocessingCanvas" xmlns:cx="http://schemas.microsoft.com/office/drawing/2014/chartex" xmlns:cx1="http://schemas.microsoft.com/office/drawing/2015/9/8/chartex" xmlns:cx2="http://schemas.microsoft.com/office/drawing/2015/10/21/chartex" xmlns:cx3="http://schemas.microsoft.com/office/drawing/2016/5/9/chartex" xmlns:cx4="http://schemas.microsoft.com/office/drawing/2016/5/10/chartex" xmlns:cx5="http://schemas.microsoft.com/office/drawing/2016/5/11/chartex" xmlns:cx6="http://schemas.microsoft.com/office/drawing/2016/5/12/chartex" xmlns:cx7="http://schemas.microsoft.com/office/drawing/2016/5/13/chartex" xmlns:cx8="http://schemas.microsoft.com/office/drawing/2016/5/14/chartex" xmlns:mc="http://schemas.openxmlformats.org/markup-compatibility/2006" xmlns:aink="http://schemas.microsoft.com/office/drawing/2016/ink" xmlns:am3d="http://schemas.microsoft.com/office/drawing/2017/model3d" xmlns:o="urn:schemas-microsoft-com:office:office" xmlns:oel="http://schemas.microsoft.com/office/2019/extlst" xmlns:r="http://schemas.openxmlformats.org/officeDocument/2006/relationships" xmlns:m="http://schemas.openxmlformats.org/officeDocument/2006/math" xmlns:v="urn:schemas-microsoft-com:vml" xmlns:wp14="http://schemas.microsoft.com/office/word/2010/wordprocessingDrawing" xmlns:wp="http://schemas.openxmlformats.org/drawingml/2006/wordprocessingDrawing" xmlns:w10="urn:schemas-microsoft-com:office:word" xmlns:w="http://schemas.openxmlformats.org/wordprocessingml/2006/main" xmlns:w14="http://schemas.microsoft.com/office/word/2010/wordml" xmlns:w15="http://schemas.microsoft.com/office/word/2012/wordml" xmlns:w16cex="http://schemas.microsoft.com/office/word/2018/wordml/cex" xmlns:w16cid="http://schemas.microsoft.com/office/word/2016/wordml/cid" xmlns:w16="http://schemas.microsoft.com/office/word/2018/wordml" xmlns:w16du="http://schemas.microsoft.com/office/word/2023/wordml/word16du" xmlns:w16sdtdh="http://schemas.microsoft.com/office/word/2020/wordml/sdtdatahash" xmlns:w16sdtfl="http://schemas.microsoft.com/office/word/2024/wordml/sdtformatlock" xmlns:w16se="http://schemas.microsoft.com/office/word/2015/wordml/symex" xmlns:wpg="http://schemas.microsoft.com/office/word/2010/wordprocessingGroup" xmlns:wpi="http://schemas.microsoft.com/office/word/2010/wordprocessingInk" xmlns:wne="http://schemas.microsoft.com/office/word/2006/wordml" xmlns:wps="http://schemas.microsoft.com/office/word/2010/wordprocessingShape" mc:Ignorable="w14 w15 w16se w16cid w16 w16cex w16sdtdh w16sdtfl w16du wp14">
+<w:document xmlns:wpc="http://schemas.microsoft.com/office/word/2010/wordprocessingCanvas" xmlns:cx="http://schemas.microsoft.com/office/drawing/2014/chartex" xmlns:cx1="http://schemas.microsoft.com/office/drawing/2015/9/8/chartex" xmlns:cx2="http://schemas.microsoft.com/office/drawing/2015/10/21/chartex" xmlns:cx3="http://schemas.microsoft.com/office/drawing/2016/5/9/chartex" xmlns:cx4="http://schemas.microsoft.com/office/drawing/2016/5/10/chartex" xmlns:cx5="http://schemas.microsoft.com/office/drawing/2016/5/11/chartex" xmlns:cx6="http://schemas.microsoft.com/office/drawing/2016/5/12/chartex" xmlns:cx7="http://schemas.microsoft.com/office/drawing/2016/5/13/chartex" xmlns:cx8="http://schemas.microsoft.com/office/drawing/2016/5/14/chartex" xmlns:mc="http://schemas.openxmlformats.org/markup-compatibility/2006" xmlns:aink="http://schemas.microsoft.com/office/drawing/2016/ink" xmlns:am3d="http://schemas.microsoft.com/office/drawing/2017/model3d" xmlns:o="urn:schemas-microsoft-com:office:office" xmlns:oel="http://schemas.microsoft.com/office/2019/extlst" xmlns:r="http://schemas.openxmlformats.org/officeDocument/2006/relationships" xmlns:m="http://schemas.openxmlformats.org/officeDocument/2006/math" xmlns:v="urn:schemas-microsoft-com:vml" xmlns:wp14="http://schemas.microsoft.com/office/word/2010/wordprocessingDrawing" xmlns:wp="http://schemas.openxmlformats.org/drawingml/2006/wordprocessingDrawing" xmlns:w10="urn:schemas-microsoft-com:office:word" xmlns:w="http://schemas.openxmlformats.org/wordprocessingml/2006/main" xmlns:w14="http://schemas.microsoft.com/office/word/2010/wordml" xmlns:w15="http://schemas.microsoft.com/office/word/2012/wordml" xmlns:w16cei="http://schemas.microsoft.com/office/word/2026/wordml/cei" xmlns:w16cex="http://schemas.microsoft.com/office/word/2018/wordml/cex" xmlns:w16cid="http://schemas.microsoft.com/office/word/2016/wordml/cid" xmlns:w16="http://schemas.microsoft.com/office/word/2018/wordml" xmlns:w16du="http://schemas.microsoft.com/office/word/2023/wordml/word16du" xmlns:w16sdtdh="http://schemas.microsoft.com/office/word/2020/wordml/sdtdatahash" xmlns:w16sdtfl="http://schemas.microsoft.com/office/word/2024/wordml/sdtformatlock" xmlns:w16se="http://schemas.microsoft.com/office/word/2015/wordml/symex" xmlns:wpg="http://schemas.microsoft.com/office/word/2010/wordprocessingGroup" xmlns:wpi="http://schemas.microsoft.com/office/word/2010/wordprocessingInk" xmlns:wne="http://schemas.microsoft.com/office/word/2006/wordml" xmlns:wps="http://schemas.microsoft.com/office/word/2010/wordprocessingShape" mc:Ignorable="w14 w15 w16se w16cid w16 w16cex w16sdtdh w16sdtfl w16du wp14">
   <w:body>
     <w:p>
       <w:pPr>
@@ -3702,6 +3702,175 @@
       </w:r>
       <w:r>
         <w:t>API Key usage</w:t>
+      </w:r>
+    </w:p>
+    <w:p/>
+    <w:p>
+      <w:r>
+        <w:drawing>
+          <wp:inline distT="0" distB="0" distL="0" distR="0" wp14:anchorId="11DAB56A" wp14:editId="0E6E660C">
+            <wp:extent cx="5685013" cy="1653683"/>
+            <wp:effectExtent l="0" t="0" r="0" b="3810"/>
+            <wp:docPr id="1191550971" name="Picture 1"/>
+            <wp:cNvGraphicFramePr>
+              <a:graphicFrameLocks xmlns:a="http://schemas.openxmlformats.org/drawingml/2006/main" noChangeAspect="1"/>
+            </wp:cNvGraphicFramePr>
+            <a:graphic xmlns:a="http://schemas.openxmlformats.org/drawingml/2006/main">
+              <a:graphicData uri="http://schemas.openxmlformats.org/drawingml/2006/picture">
+                <pic:pic xmlns:pic="http://schemas.openxmlformats.org/drawingml/2006/picture">
+                  <pic:nvPicPr>
+                    <pic:cNvPr id="1191550971" name=""/>
+                    <pic:cNvPicPr/>
+                  </pic:nvPicPr>
+                  <pic:blipFill>
+                    <a:blip r:embed="rId67"/>
+                    <a:stretch>
+                      <a:fillRect/>
+                    </a:stretch>
+                  </pic:blipFill>
+                  <pic:spPr>
+                    <a:xfrm>
+                      <a:off x="0" y="0"/>
+                      <a:ext cx="5685013" cy="1653683"/>
+                    </a:xfrm>
+                    <a:prstGeom prst="rect">
+                      <a:avLst/>
+                    </a:prstGeom>
+                  </pic:spPr>
+                </pic:pic>
+              </a:graphicData>
+            </a:graphic>
+          </wp:inline>
+        </w:drawing>
+      </w:r>
+    </w:p>
+    <w:p/>
+    <w:p>
+      <w:r>
+        <w:drawing>
+          <wp:inline distT="0" distB="0" distL="0" distR="0" wp14:anchorId="4332DAF4" wp14:editId="1106A699">
+            <wp:extent cx="4740051" cy="1463167"/>
+            <wp:effectExtent l="0" t="0" r="3810" b="3810"/>
+            <wp:docPr id="335704239" name="Picture 1"/>
+            <wp:cNvGraphicFramePr>
+              <a:graphicFrameLocks xmlns:a="http://schemas.openxmlformats.org/drawingml/2006/main" noChangeAspect="1"/>
+            </wp:cNvGraphicFramePr>
+            <a:graphic xmlns:a="http://schemas.openxmlformats.org/drawingml/2006/main">
+              <a:graphicData uri="http://schemas.openxmlformats.org/drawingml/2006/picture">
+                <pic:pic xmlns:pic="http://schemas.openxmlformats.org/drawingml/2006/picture">
+                  <pic:nvPicPr>
+                    <pic:cNvPr id="335704239" name=""/>
+                    <pic:cNvPicPr/>
+                  </pic:nvPicPr>
+                  <pic:blipFill>
+                    <a:blip r:embed="rId68"/>
+                    <a:stretch>
+                      <a:fillRect/>
+                    </a:stretch>
+                  </pic:blipFill>
+                  <pic:spPr>
+                    <a:xfrm>
+                      <a:off x="0" y="0"/>
+                      <a:ext cx="4740051" cy="1463167"/>
+                    </a:xfrm>
+                    <a:prstGeom prst="rect">
+                      <a:avLst/>
+                    </a:prstGeom>
+                  </pic:spPr>
+                </pic:pic>
+              </a:graphicData>
+            </a:graphic>
+          </wp:inline>
+        </w:drawing>
+      </w:r>
+    </w:p>
+    <w:p/>
+    <w:p>
+      <w:r>
+        <w:drawing>
+          <wp:inline distT="0" distB="0" distL="0" distR="0" wp14:anchorId="73891869" wp14:editId="6D7A6BCD">
+            <wp:extent cx="5692633" cy="1044030"/>
+            <wp:effectExtent l="0" t="0" r="3810" b="3810"/>
+            <wp:docPr id="981248956" name="Picture 1"/>
+            <wp:cNvGraphicFramePr>
+              <a:graphicFrameLocks xmlns:a="http://schemas.openxmlformats.org/drawingml/2006/main" noChangeAspect="1"/>
+            </wp:cNvGraphicFramePr>
+            <a:graphic xmlns:a="http://schemas.openxmlformats.org/drawingml/2006/main">
+              <a:graphicData uri="http://schemas.openxmlformats.org/drawingml/2006/picture">
+                <pic:pic xmlns:pic="http://schemas.openxmlformats.org/drawingml/2006/picture">
+                  <pic:nvPicPr>
+                    <pic:cNvPr id="981248956" name=""/>
+                    <pic:cNvPicPr/>
+                  </pic:nvPicPr>
+                  <pic:blipFill>
+                    <a:blip r:embed="rId69"/>
+                    <a:stretch>
+                      <a:fillRect/>
+                    </a:stretch>
+                  </pic:blipFill>
+                  <pic:spPr>
+                    <a:xfrm>
+                      <a:off x="0" y="0"/>
+                      <a:ext cx="5692633" cy="1044030"/>
+                    </a:xfrm>
+                    <a:prstGeom prst="rect">
+                      <a:avLst/>
+                    </a:prstGeom>
+                  </pic:spPr>
+                </pic:pic>
+              </a:graphicData>
+            </a:graphic>
+          </wp:inline>
+        </w:drawing>
+      </w:r>
+    </w:p>
+    <w:p>
+      <w:r>
+        <w:lastRenderedPageBreak/>
+        <w:t>LLM with tools consume more input token than normal llm</w:t>
+      </w:r>
+      <w:r>
+        <w:t xml:space="preserve"> model due to metadata for tool.</w:t>
+      </w:r>
+    </w:p>
+    <w:p/>
+    <w:p>
+      <w:r>
+        <w:drawing>
+          <wp:inline distT="0" distB="0" distL="0" distR="0" wp14:anchorId="7D7F9EE6" wp14:editId="73CE5543">
+            <wp:extent cx="5731510" cy="2760980"/>
+            <wp:effectExtent l="0" t="0" r="2540" b="1270"/>
+            <wp:docPr id="2123934956" name="Picture 1"/>
+            <wp:cNvGraphicFramePr>
+              <a:graphicFrameLocks xmlns:a="http://schemas.openxmlformats.org/drawingml/2006/main" noChangeAspect="1"/>
+            </wp:cNvGraphicFramePr>
+            <a:graphic xmlns:a="http://schemas.openxmlformats.org/drawingml/2006/main">
+              <a:graphicData uri="http://schemas.openxmlformats.org/drawingml/2006/picture">
+                <pic:pic xmlns:pic="http://schemas.openxmlformats.org/drawingml/2006/picture">
+                  <pic:nvPicPr>
+                    <pic:cNvPr id="2123934956" name=""/>
+                    <pic:cNvPicPr/>
+                  </pic:nvPicPr>
+                  <pic:blipFill>
+                    <a:blip r:embed="rId70"/>
+                    <a:stretch>
+                      <a:fillRect/>
+                    </a:stretch>
+                  </pic:blipFill>
+                  <pic:spPr>
+                    <a:xfrm>
+                      <a:off x="0" y="0"/>
+                      <a:ext cx="5731510" cy="2760980"/>
+                    </a:xfrm>
+                    <a:prstGeom prst="rect">
+                      <a:avLst/>
+                    </a:prstGeom>
+                  </pic:spPr>
+                </pic:pic>
+              </a:graphicData>
+            </a:graphic>
+          </wp:inline>
+        </w:drawing>
       </w:r>
     </w:p>
     <w:p/>
@@ -3784,7 +3953,7 @@
 </file>
 
 <file path=word/numbering.xml><?xml version="1.0" encoding="utf-8"?>
-<w:numbering xmlns:wpc="http://schemas.microsoft.com/office/word/2010/wordprocessingCanvas" xmlns:cx="http://schemas.microsoft.com/office/drawing/2014/chartex" xmlns:cx1="http://schemas.microsoft.com/office/drawing/2015/9/8/chartex" xmlns:cx2="http://schemas.microsoft.com/office/drawing/2015/10/21/chartex" xmlns:cx3="http://schemas.microsoft.com/office/drawing/2016/5/9/chartex" xmlns:cx4="http://schemas.microsoft.com/office/drawing/2016/5/10/chartex" xmlns:cx5="http://schemas.microsoft.com/office/drawing/2016/5/11/chartex" xmlns:cx6="http://schemas.microsoft.com/office/drawing/2016/5/12/chartex" xmlns:cx7="http://schemas.microsoft.com/office/drawing/2016/5/13/chartex" xmlns:cx8="http://schemas.microsoft.com/office/drawing/2016/5/14/chartex" xmlns:mc="http://schemas.openxmlformats.org/markup-compatibility/2006" xmlns:aink="http://schemas.microsoft.com/office/drawing/2016/ink" xmlns:am3d="http://schemas.microsoft.com/office/drawing/2017/model3d" xmlns:o="urn:schemas-microsoft-com:office:office" xmlns:oel="http://schemas.microsoft.com/office/2019/extlst" xmlns:r="http://schemas.openxmlformats.org/officeDocument/2006/relationships" xmlns:m="http://schemas.openxmlformats.org/officeDocument/2006/math" xmlns:v="urn:schemas-microsoft-com:vml" xmlns:wp14="http://schemas.microsoft.com/office/word/2010/wordprocessingDrawing" xmlns:wp="http://schemas.openxmlformats.org/drawingml/2006/wordprocessingDrawing" xmlns:w10="urn:schemas-microsoft-com:office:word" xmlns:w="http://schemas.openxmlformats.org/wordprocessingml/2006/main" xmlns:w14="http://schemas.microsoft.com/office/word/2010/wordml" xmlns:w15="http://schemas.microsoft.com/office/word/2012/wordml" xmlns:w16cex="http://schemas.microsoft.com/office/word/2018/wordml/cex" xmlns:w16cid="http://schemas.microsoft.com/office/word/2016/wordml/cid" xmlns:w16="http://schemas.microsoft.com/office/word/2018/wordml" xmlns:w16du="http://schemas.microsoft.com/office/word/2023/wordml/word16du" xmlns:w16sdtdh="http://schemas.microsoft.com/office/word/2020/wordml/sdtdatahash" xmlns:w16sdtfl="http://schemas.microsoft.com/office/word/2024/wordml/sdtformatlock" xmlns:w16se="http://schemas.microsoft.com/office/word/2015/wordml/symex" xmlns:wpg="http://schemas.microsoft.com/office/word/2010/wordprocessingGroup" xmlns:wpi="http://schemas.microsoft.com/office/word/2010/wordprocessingInk" xmlns:wne="http://schemas.microsoft.com/office/word/2006/wordml" xmlns:wps="http://schemas.microsoft.com/office/word/2010/wordprocessingShape" mc:Ignorable="w14 w15 w16se w16cid w16 w16cex w16sdtdh w16sdtfl w16du wp14">
+<w:numbering xmlns:wpc="http://schemas.microsoft.com/office/word/2010/wordprocessingCanvas" xmlns:cx="http://schemas.microsoft.com/office/drawing/2014/chartex" xmlns:cx1="http://schemas.microsoft.com/office/drawing/2015/9/8/chartex" xmlns:cx2="http://schemas.microsoft.com/office/drawing/2015/10/21/chartex" xmlns:cx3="http://schemas.microsoft.com/office/drawing/2016/5/9/chartex" xmlns:cx4="http://schemas.microsoft.com/office/drawing/2016/5/10/chartex" xmlns:cx5="http://schemas.microsoft.com/office/drawing/2016/5/11/chartex" xmlns:cx6="http://schemas.microsoft.com/office/drawing/2016/5/12/chartex" xmlns:cx7="http://schemas.microsoft.com/office/drawing/2016/5/13/chartex" xmlns:cx8="http://schemas.microsoft.com/office/drawing/2016/5/14/chartex" xmlns:mc="http://schemas.openxmlformats.org/markup-compatibility/2006" xmlns:aink="http://schemas.microsoft.com/office/drawing/2016/ink" xmlns:am3d="http://schemas.microsoft.com/office/drawing/2017/model3d" xmlns:o="urn:schemas-microsoft-com:office:office" xmlns:oel="http://schemas.microsoft.com/office/2019/extlst" xmlns:r="http://schemas.openxmlformats.org/officeDocument/2006/relationships" xmlns:m="http://schemas.openxmlformats.org/officeDocument/2006/math" xmlns:v="urn:schemas-microsoft-com:vml" xmlns:wp14="http://schemas.microsoft.com/office/word/2010/wordprocessingDrawing" xmlns:wp="http://schemas.openxmlformats.org/drawingml/2006/wordprocessingDrawing" xmlns:w10="urn:schemas-microsoft-com:office:word" xmlns:w="http://schemas.openxmlformats.org/wordprocessingml/2006/main" xmlns:w14="http://schemas.microsoft.com/office/word/2010/wordml" xmlns:w15="http://schemas.microsoft.com/office/word/2012/wordml" xmlns:w16cei="http://schemas.microsoft.com/office/word/2026/wordml/cei" xmlns:w16cex="http://schemas.microsoft.com/office/word/2018/wordml/cex" xmlns:w16cid="http://schemas.microsoft.com/office/word/2016/wordml/cid" xmlns:w16="http://schemas.microsoft.com/office/word/2018/wordml" xmlns:w16du="http://schemas.microsoft.com/office/word/2023/wordml/word16du" xmlns:w16sdtdh="http://schemas.microsoft.com/office/word/2020/wordml/sdtdatahash" xmlns:w16sdtfl="http://schemas.microsoft.com/office/word/2024/wordml/sdtformatlock" xmlns:w16se="http://schemas.microsoft.com/office/word/2015/wordml/symex" xmlns:wpg="http://schemas.microsoft.com/office/word/2010/wordprocessingGroup" xmlns:wpi="http://schemas.microsoft.com/office/word/2010/wordprocessingInk" xmlns:wne="http://schemas.microsoft.com/office/word/2006/wordml" xmlns:wps="http://schemas.microsoft.com/office/word/2010/wordprocessingShape" mc:Ignorable="w14 w15 w16se w16cid w16 w16cex w16sdtdh w16sdtfl w16du wp14">
   <w:abstractNum w:abstractNumId="0" w15:restartNumberingAfterBreak="0">
     <w:nsid w:val="270B04E2"/>
     <w:multiLevelType w:val="multilevel"/>

</xml_diff>